<commit_message>
Subida de archivo pdf
</commit_message>
<xml_diff>
--- a/Clemente_Byron_Actividad1.docx
+++ b/Clemente_Byron_Actividad1.docx
@@ -1219,6 +1219,20 @@
           <w:lang w:eastAsia="es-EC"/>
         </w:rPr>
       </w:pPr>
+      <w:hyperlink r:id="rId16" w:history="1">
+        <w:r>
+          <w:rPr>
+            <w:rStyle w:val="Hipervnculo"/>
+            <w:rFonts w:ascii="Times New Roman" w:hAnsi="Times New Roman" w:cs="Times New Roman"/>
+            <w:b/>
+            <w:bCs/>
+            <w:sz w:val="20"/>
+            <w:szCs w:val="20"/>
+            <w:lang w:eastAsia="es-EC"/>
+          </w:rPr>
+          <w:t>https://github.com/bclemente2210-cell/Actividad1SDI</w:t>
+        </w:r>
+      </w:hyperlink>
     </w:p>
     <w:p>
       <w:pPr>
@@ -1229,20 +1243,35 @@
           <w:rFonts w:ascii="Times New Roman" w:hAnsi="Times New Roman" w:cs="Times New Roman"/>
           <w:b/>
           <w:bCs/>
-          <w:i/>
-          <w:iCs/>
-          <w:sz w:val="24"/>
-          <w:szCs w:val="24"/>
-          <w:lang w:eastAsia="es-EC"/>
-        </w:rPr>
-      </w:pPr>
-      <w:r>
+          <w:sz w:val="20"/>
+          <w:szCs w:val="20"/>
+          <w:lang w:eastAsia="es-EC"/>
+        </w:rPr>
+      </w:pPr>
+    </w:p>
+    <w:p>
+      <w:pPr>
+        <w:pStyle w:val="Sinespaciado"/>
+        <w:numPr>
+          <w:ilvl w:val="0"/>
+          <w:numId w:val="25"/>
+        </w:numPr>
+        <w:spacing w:line="360" w:lineRule="auto"/>
+        <w:jc w:val="both"/>
         <w:rPr>
           <w:rFonts w:ascii="Times New Roman" w:hAnsi="Times New Roman" w:cs="Times New Roman"/>
           <w:b/>
           <w:bCs/>
-          <w:i/>
-          <w:iCs/>
+          <w:sz w:val="24"/>
+          <w:szCs w:val="24"/>
+          <w:lang w:eastAsia="es-EC"/>
+        </w:rPr>
+      </w:pPr>
+      <w:r>
+        <w:rPr>
+          <w:rFonts w:ascii="Times New Roman" w:hAnsi="Times New Roman" w:cs="Times New Roman"/>
+          <w:b/>
+          <w:bCs/>
           <w:sz w:val="24"/>
           <w:szCs w:val="24"/>
           <w:lang w:eastAsia="es-EC"/>
@@ -1319,6 +1348,10 @@
     <w:p>
       <w:pPr>
         <w:pStyle w:val="Sinespaciado"/>
+        <w:numPr>
+          <w:ilvl w:val="0"/>
+          <w:numId w:val="25"/>
+        </w:numPr>
         <w:spacing w:line="360" w:lineRule="auto"/>
         <w:jc w:val="both"/>
         <w:rPr>
@@ -1501,6 +1534,11 @@
     </w:p>
     <w:p>
       <w:pPr>
+        <w:pStyle w:val="Prrafodelista"/>
+        <w:numPr>
+          <w:ilvl w:val="0"/>
+          <w:numId w:val="25"/>
+        </w:numPr>
         <w:spacing w:line="360" w:lineRule="auto"/>
         <w:rPr>
           <w:rFonts w:ascii="Times New Roman" w:hAnsi="Times New Roman" w:cs="Times New Roman"/>
@@ -1767,6 +1805,11 @@
     </w:p>
     <w:p>
       <w:pPr>
+        <w:pStyle w:val="Prrafodelista"/>
+        <w:numPr>
+          <w:ilvl w:val="0"/>
+          <w:numId w:val="25"/>
+        </w:numPr>
         <w:spacing w:line="276" w:lineRule="auto"/>
         <w:rPr>
           <w:rFonts w:ascii="Arial" w:hAnsi="Arial" w:cs="Arial"/>
@@ -2251,7 +2294,6 @@
                 <w:sz w:val="24"/>
                 <w:szCs w:val="24"/>
               </w:rPr>
-              <w:lastRenderedPageBreak/>
               <w:t>RF06</w:t>
             </w:r>
           </w:p>
@@ -3356,6 +3398,11 @@
     </w:p>
     <w:p>
       <w:pPr>
+        <w:pStyle w:val="Prrafodelista"/>
+        <w:numPr>
+          <w:ilvl w:val="0"/>
+          <w:numId w:val="25"/>
+        </w:numPr>
         <w:spacing w:line="360" w:lineRule="auto"/>
         <w:rPr>
           <w:rFonts w:ascii="Arial" w:hAnsi="Arial" w:cs="Arial"/>
@@ -3775,7 +3822,6 @@
                 <w:sz w:val="24"/>
                 <w:szCs w:val="24"/>
               </w:rPr>
-              <w:lastRenderedPageBreak/>
               <w:t>RNF05</w:t>
             </w:r>
           </w:p>
@@ -3844,6 +3890,11 @@
     </w:p>
     <w:p>
       <w:pPr>
+        <w:pStyle w:val="Prrafodelista"/>
+        <w:numPr>
+          <w:ilvl w:val="0"/>
+          <w:numId w:val="25"/>
+        </w:numPr>
         <w:spacing w:line="360" w:lineRule="auto"/>
         <w:jc w:val="both"/>
         <w:rPr>
@@ -3864,7 +3915,7 @@
           <w:szCs w:val="24"/>
           <w:lang w:eastAsia="es-EC"/>
         </w:rPr>
-        <w:t>DIAGRAMAS DE CLASES UML</w:t>
+        <w:t>Diagramas de clases UML</w:t>
       </w:r>
     </w:p>
     <w:p>
@@ -3906,7 +3957,7 @@
                     <pic:cNvPicPr/>
                   </pic:nvPicPr>
                   <pic:blipFill>
-                    <a:blip r:embed="rId16" cstate="print">
+                    <a:blip r:embed="rId17" cstate="print">
                       <a:extLst>
                         <a:ext uri="{28A0092B-C50C-407E-A947-70E740481C1C}">
                           <a14:useLocalDpi xmlns:a14="http://schemas.microsoft.com/office/drawing/2010/main" val="0"/>
@@ -3946,6 +3997,25 @@
           <w:lang w:eastAsia="es-EC"/>
         </w:rPr>
       </w:pPr>
+    </w:p>
+    <w:p>
+      <w:pPr>
+        <w:pStyle w:val="Prrafodelista"/>
+        <w:numPr>
+          <w:ilvl w:val="0"/>
+          <w:numId w:val="25"/>
+        </w:numPr>
+        <w:spacing w:line="360" w:lineRule="auto"/>
+        <w:jc w:val="both"/>
+        <w:rPr>
+          <w:rFonts w:ascii="Times New Roman" w:hAnsi="Times New Roman" w:cs="Times New Roman"/>
+          <w:b/>
+          <w:bCs/>
+          <w:sz w:val="24"/>
+          <w:szCs w:val="24"/>
+          <w:lang w:eastAsia="es-EC"/>
+        </w:rPr>
+      </w:pPr>
       <w:r>
         <w:rPr>
           <w:rFonts w:ascii="Times New Roman" w:hAnsi="Times New Roman" w:cs="Times New Roman"/>
@@ -3997,7 +4067,7 @@
                     <pic:cNvPicPr/>
                   </pic:nvPicPr>
                   <pic:blipFill>
-                    <a:blip r:embed="rId17" cstate="print">
+                    <a:blip r:embed="rId18" cstate="print">
                       <a:extLst>
                         <a:ext uri="{28A0092B-C50C-407E-A947-70E740481C1C}">
                           <a14:useLocalDpi xmlns:a14="http://schemas.microsoft.com/office/drawing/2010/main" val="0"/>
@@ -4037,17 +4107,6 @@
           <w:lang w:eastAsia="es-EC"/>
         </w:rPr>
       </w:pPr>
-      <w:r>
-        <w:rPr>
-          <w:rFonts w:ascii="Times New Roman" w:hAnsi="Times New Roman" w:cs="Times New Roman"/>
-          <w:b/>
-          <w:bCs/>
-          <w:sz w:val="24"/>
-          <w:szCs w:val="24"/>
-          <w:lang w:eastAsia="es-EC"/>
-        </w:rPr>
-        <w:t>MVC (Modelo-Vista-Controlador)</w:t>
-      </w:r>
     </w:p>
     <w:p>
       <w:pPr>
@@ -4055,114 +4114,51 @@
         <w:jc w:val="both"/>
         <w:rPr>
           <w:rFonts w:ascii="Times New Roman" w:hAnsi="Times New Roman" w:cs="Times New Roman"/>
-          <w:sz w:val="24"/>
-          <w:szCs w:val="24"/>
-          <w:lang w:eastAsia="es-EC"/>
-        </w:rPr>
-      </w:pPr>
-      <w:r>
-        <w:rPr>
-          <w:rFonts w:ascii="Times New Roman" w:hAnsi="Times New Roman" w:cs="Times New Roman"/>
-          <w:sz w:val="24"/>
-          <w:szCs w:val="24"/>
-          <w:lang w:eastAsia="es-EC"/>
-        </w:rPr>
-        <w:t xml:space="preserve">Separar la interfaz gráfica, el procesamiento de las solicitudes y los datos del sistema, en el sistema de rescate, </w:t>
-      </w:r>
-      <w:proofErr w:type="spellStart"/>
-      <w:r>
-        <w:rPr>
-          <w:rFonts w:ascii="Times New Roman" w:hAnsi="Times New Roman" w:cs="Times New Roman"/>
-          <w:sz w:val="24"/>
-          <w:szCs w:val="24"/>
-          <w:lang w:eastAsia="es-EC"/>
-        </w:rPr>
-        <w:t>VistaRegistroRescate</w:t>
-      </w:r>
-      <w:proofErr w:type="spellEnd"/>
-      <w:r>
-        <w:rPr>
-          <w:rFonts w:ascii="Times New Roman" w:hAnsi="Times New Roman" w:cs="Times New Roman"/>
-          <w:sz w:val="24"/>
-          <w:szCs w:val="24"/>
-          <w:lang w:eastAsia="es-EC"/>
-        </w:rPr>
-        <w:t xml:space="preserve"> muestra el formulario que utiliza el </w:t>
-      </w:r>
-      <w:r>
-        <w:rPr>
-          <w:rFonts w:ascii="Times New Roman" w:hAnsi="Times New Roman" w:cs="Times New Roman"/>
-          <w:sz w:val="24"/>
-          <w:szCs w:val="24"/>
-          <w:lang w:eastAsia="es-EC"/>
-        </w:rPr>
-        <w:lastRenderedPageBreak/>
-        <w:t xml:space="preserve">ciudadano. </w:t>
-      </w:r>
-      <w:proofErr w:type="spellStart"/>
-      <w:r>
-        <w:rPr>
-          <w:rFonts w:ascii="Times New Roman" w:hAnsi="Times New Roman" w:cs="Times New Roman"/>
-          <w:sz w:val="24"/>
-          <w:szCs w:val="24"/>
-          <w:lang w:eastAsia="es-EC"/>
-        </w:rPr>
-        <w:t>ControladorRescate</w:t>
-      </w:r>
-      <w:proofErr w:type="spellEnd"/>
-      <w:r>
-        <w:rPr>
-          <w:rFonts w:ascii="Times New Roman" w:hAnsi="Times New Roman" w:cs="Times New Roman"/>
-          <w:sz w:val="24"/>
-          <w:szCs w:val="24"/>
-          <w:lang w:eastAsia="es-EC"/>
-        </w:rPr>
-        <w:t xml:space="preserve"> recibe los datos y valida la solicitud y, </w:t>
-      </w:r>
-      <w:proofErr w:type="spellStart"/>
-      <w:r>
-        <w:rPr>
-          <w:rFonts w:ascii="Times New Roman" w:hAnsi="Times New Roman" w:cs="Times New Roman"/>
-          <w:sz w:val="24"/>
-          <w:szCs w:val="24"/>
-          <w:lang w:eastAsia="es-EC"/>
-        </w:rPr>
-        <w:t>ServicioRescate</w:t>
-      </w:r>
-      <w:proofErr w:type="spellEnd"/>
-      <w:r>
-        <w:rPr>
-          <w:rFonts w:ascii="Times New Roman" w:hAnsi="Times New Roman" w:cs="Times New Roman"/>
-          <w:sz w:val="24"/>
-          <w:szCs w:val="24"/>
-          <w:lang w:eastAsia="es-EC"/>
-        </w:rPr>
-        <w:t xml:space="preserve"> coordina el registro del caso y las clases de modelo representan la información del animal y del rescate.</w:t>
-      </w:r>
-    </w:p>
-    <w:p>
-      <w:pPr>
+          <w:b/>
+          <w:bCs/>
+          <w:sz w:val="24"/>
+          <w:szCs w:val="24"/>
+          <w:lang w:eastAsia="es-EC"/>
+        </w:rPr>
+      </w:pPr>
+    </w:p>
+    <w:p>
+      <w:pPr>
+        <w:pStyle w:val="Prrafodelista"/>
+        <w:numPr>
+          <w:ilvl w:val="0"/>
+          <w:numId w:val="25"/>
+        </w:numPr>
         <w:spacing w:line="360" w:lineRule="auto"/>
         <w:jc w:val="both"/>
         <w:rPr>
           <w:rFonts w:ascii="Times New Roman" w:hAnsi="Times New Roman" w:cs="Times New Roman"/>
-          <w:sz w:val="24"/>
-          <w:szCs w:val="24"/>
-          <w:lang w:eastAsia="es-EC"/>
-        </w:rPr>
-      </w:pPr>
-      <w:r>
-        <w:rPr>
-          <w:rFonts w:ascii="Times New Roman" w:hAnsi="Times New Roman" w:cs="Times New Roman"/>
-          <w:sz w:val="24"/>
-          <w:szCs w:val="24"/>
-          <w:lang w:eastAsia="es-EC"/>
-        </w:rPr>
-        <w:t>Este patrón facilita el mantenimiento, ya que los cambios en el formulario no tienen que modificar directamente las clases encargadas de almacenar los casos.</w:t>
-      </w:r>
-    </w:p>
-    <w:p>
-      <w:pPr>
+          <w:b/>
+          <w:bCs/>
+          <w:sz w:val="24"/>
+          <w:szCs w:val="24"/>
+          <w:lang w:eastAsia="es-EC"/>
+        </w:rPr>
+      </w:pPr>
+      <w:r>
+        <w:rPr>
+          <w:rFonts w:ascii="Times New Roman" w:hAnsi="Times New Roman" w:cs="Times New Roman"/>
+          <w:b/>
+          <w:bCs/>
+          <w:sz w:val="24"/>
+          <w:szCs w:val="24"/>
+          <w:lang w:eastAsia="es-EC"/>
+        </w:rPr>
+        <w:t>Aplicación de patrones de diseño</w:t>
+      </w:r>
+    </w:p>
+    <w:p>
+      <w:pPr>
+        <w:pStyle w:val="Prrafodelista"/>
+        <w:numPr>
+          <w:ilvl w:val="0"/>
+          <w:numId w:val="24"/>
+        </w:numPr>
         <w:spacing w:line="360" w:lineRule="auto"/>
         <w:jc w:val="both"/>
         <w:rPr>
@@ -4183,21 +4179,8 @@
           <w:szCs w:val="24"/>
           <w:lang w:eastAsia="es-EC"/>
         </w:rPr>
-        <w:t xml:space="preserve">3.2. Factory </w:t>
-      </w:r>
-      <w:proofErr w:type="spellStart"/>
-      <w:r>
-        <w:rPr>
-          <w:rFonts w:ascii="Times New Roman" w:hAnsi="Times New Roman" w:cs="Times New Roman"/>
-          <w:b/>
-          <w:bCs/>
-          <w:sz w:val="24"/>
-          <w:szCs w:val="24"/>
-          <w:lang w:eastAsia="es-EC"/>
-        </w:rPr>
-        <w:t>Method</w:t>
-      </w:r>
-      <w:proofErr w:type="spellEnd"/>
+        <w:t>MVC (Modelo-Vista-Controlador)</w:t>
+      </w:r>
     </w:p>
     <w:p>
       <w:pPr>
@@ -4217,7 +4200,67 @@
           <w:szCs w:val="24"/>
           <w:lang w:eastAsia="es-EC"/>
         </w:rPr>
-        <w:t>Crea objetos mediante métodos de fábrica, evitando que el controlador tenga que construir directamente cada tipo de expediente.</w:t>
+        <w:t xml:space="preserve">Separar la interfaz gráfica, el procesamiento de las solicitudes y los datos del sistema, en el sistema de rescate, </w:t>
+      </w:r>
+      <w:proofErr w:type="spellStart"/>
+      <w:r>
+        <w:rPr>
+          <w:rFonts w:ascii="Times New Roman" w:hAnsi="Times New Roman" w:cs="Times New Roman"/>
+          <w:sz w:val="24"/>
+          <w:szCs w:val="24"/>
+          <w:lang w:eastAsia="es-EC"/>
+        </w:rPr>
+        <w:t>VistaRegistroRescate</w:t>
+      </w:r>
+      <w:proofErr w:type="spellEnd"/>
+      <w:r>
+        <w:rPr>
+          <w:rFonts w:ascii="Times New Roman" w:hAnsi="Times New Roman" w:cs="Times New Roman"/>
+          <w:sz w:val="24"/>
+          <w:szCs w:val="24"/>
+          <w:lang w:eastAsia="es-EC"/>
+        </w:rPr>
+        <w:t xml:space="preserve"> muestra el formulario que utiliza el ciudadano. </w:t>
+      </w:r>
+      <w:proofErr w:type="spellStart"/>
+      <w:r>
+        <w:rPr>
+          <w:rFonts w:ascii="Times New Roman" w:hAnsi="Times New Roman" w:cs="Times New Roman"/>
+          <w:sz w:val="24"/>
+          <w:szCs w:val="24"/>
+          <w:lang w:eastAsia="es-EC"/>
+        </w:rPr>
+        <w:t>ControladorRescate</w:t>
+      </w:r>
+      <w:proofErr w:type="spellEnd"/>
+      <w:r>
+        <w:rPr>
+          <w:rFonts w:ascii="Times New Roman" w:hAnsi="Times New Roman" w:cs="Times New Roman"/>
+          <w:sz w:val="24"/>
+          <w:szCs w:val="24"/>
+          <w:lang w:eastAsia="es-EC"/>
+        </w:rPr>
+        <w:t xml:space="preserve"> recibe los datos y valida la solicitud y, </w:t>
+      </w:r>
+      <w:proofErr w:type="spellStart"/>
+      <w:r>
+        <w:rPr>
+          <w:rFonts w:ascii="Times New Roman" w:hAnsi="Times New Roman" w:cs="Times New Roman"/>
+          <w:sz w:val="24"/>
+          <w:szCs w:val="24"/>
+          <w:lang w:eastAsia="es-EC"/>
+        </w:rPr>
+        <w:t>ServicioRescate</w:t>
+      </w:r>
+      <w:proofErr w:type="spellEnd"/>
+      <w:r>
+        <w:rPr>
+          <w:rFonts w:ascii="Times New Roman" w:hAnsi="Times New Roman" w:cs="Times New Roman"/>
+          <w:sz w:val="24"/>
+          <w:szCs w:val="24"/>
+          <w:lang w:eastAsia="es-EC"/>
+        </w:rPr>
+        <w:t xml:space="preserve"> coordina el registro del caso y las clases de modelo representan la información del animal y del rescate.</w:t>
       </w:r>
     </w:p>
     <w:p>
@@ -4238,6 +4281,91 @@
           <w:szCs w:val="24"/>
           <w:lang w:eastAsia="es-EC"/>
         </w:rPr>
+        <w:t>Este patrón facilita el mantenimiento, ya que los cambios en el formulario no tienen que modificar directamente las clases encargadas de almacenar los casos.</w:t>
+      </w:r>
+    </w:p>
+    <w:p>
+      <w:pPr>
+        <w:pStyle w:val="Prrafodelista"/>
+        <w:numPr>
+          <w:ilvl w:val="0"/>
+          <w:numId w:val="24"/>
+        </w:numPr>
+        <w:spacing w:line="360" w:lineRule="auto"/>
+        <w:jc w:val="both"/>
+        <w:rPr>
+          <w:rFonts w:ascii="Times New Roman" w:hAnsi="Times New Roman" w:cs="Times New Roman"/>
+          <w:b/>
+          <w:bCs/>
+          <w:sz w:val="24"/>
+          <w:szCs w:val="24"/>
+          <w:lang w:eastAsia="es-EC"/>
+        </w:rPr>
+      </w:pPr>
+      <w:r>
+        <w:rPr>
+          <w:rFonts w:ascii="Times New Roman" w:hAnsi="Times New Roman" w:cs="Times New Roman"/>
+          <w:b/>
+          <w:bCs/>
+          <w:sz w:val="24"/>
+          <w:szCs w:val="24"/>
+          <w:lang w:eastAsia="es-EC"/>
+        </w:rPr>
+        <w:t xml:space="preserve">Factory </w:t>
+      </w:r>
+      <w:proofErr w:type="spellStart"/>
+      <w:r>
+        <w:rPr>
+          <w:rFonts w:ascii="Times New Roman" w:hAnsi="Times New Roman" w:cs="Times New Roman"/>
+          <w:b/>
+          <w:bCs/>
+          <w:sz w:val="24"/>
+          <w:szCs w:val="24"/>
+          <w:lang w:eastAsia="es-EC"/>
+        </w:rPr>
+        <w:t>Method</w:t>
+      </w:r>
+      <w:proofErr w:type="spellEnd"/>
+    </w:p>
+    <w:p>
+      <w:pPr>
+        <w:spacing w:line="360" w:lineRule="auto"/>
+        <w:jc w:val="both"/>
+        <w:rPr>
+          <w:rFonts w:ascii="Times New Roman" w:hAnsi="Times New Roman" w:cs="Times New Roman"/>
+          <w:sz w:val="24"/>
+          <w:szCs w:val="24"/>
+          <w:lang w:eastAsia="es-EC"/>
+        </w:rPr>
+      </w:pPr>
+      <w:r>
+        <w:rPr>
+          <w:rFonts w:ascii="Times New Roman" w:hAnsi="Times New Roman" w:cs="Times New Roman"/>
+          <w:sz w:val="24"/>
+          <w:szCs w:val="24"/>
+          <w:lang w:eastAsia="es-EC"/>
+        </w:rPr>
+        <w:t>Crea objetos mediante métodos de fábrica, evitando que el controlador tenga que construir directamente cada tipo de expediente.</w:t>
+      </w:r>
+    </w:p>
+    <w:p>
+      <w:pPr>
+        <w:spacing w:line="360" w:lineRule="auto"/>
+        <w:jc w:val="both"/>
+        <w:rPr>
+          <w:rFonts w:ascii="Times New Roman" w:hAnsi="Times New Roman" w:cs="Times New Roman"/>
+          <w:sz w:val="24"/>
+          <w:szCs w:val="24"/>
+          <w:lang w:eastAsia="es-EC"/>
+        </w:rPr>
+      </w:pPr>
+      <w:r>
+        <w:rPr>
+          <w:rFonts w:ascii="Times New Roman" w:hAnsi="Times New Roman" w:cs="Times New Roman"/>
+          <w:sz w:val="24"/>
+          <w:szCs w:val="24"/>
+          <w:lang w:eastAsia="es-EC"/>
+        </w:rPr>
         <w:t xml:space="preserve">La clase abstracta </w:t>
       </w:r>
       <w:proofErr w:type="spellStart"/>
@@ -4355,6 +4483,11 @@
     </w:p>
     <w:p>
       <w:pPr>
+        <w:pStyle w:val="Prrafodelista"/>
+        <w:numPr>
+          <w:ilvl w:val="0"/>
+          <w:numId w:val="24"/>
+        </w:numPr>
         <w:spacing w:line="360" w:lineRule="auto"/>
         <w:jc w:val="both"/>
         <w:rPr>
@@ -4366,17 +4499,6 @@
           <w:lang w:eastAsia="es-EC"/>
         </w:rPr>
       </w:pPr>
-      <w:r>
-        <w:rPr>
-          <w:rFonts w:ascii="Times New Roman" w:hAnsi="Times New Roman" w:cs="Times New Roman"/>
-          <w:b/>
-          <w:bCs/>
-          <w:sz w:val="24"/>
-          <w:szCs w:val="24"/>
-          <w:lang w:eastAsia="es-EC"/>
-        </w:rPr>
-        <w:t xml:space="preserve">3.3. </w:t>
-      </w:r>
       <w:proofErr w:type="spellStart"/>
       <w:r>
         <w:rPr>
@@ -4526,17 +4648,6 @@
           <w:lang w:eastAsia="es-EC"/>
         </w:rPr>
       </w:pPr>
-      <w:r>
-        <w:rPr>
-          <w:rFonts w:ascii="Times New Roman" w:hAnsi="Times New Roman" w:cs="Times New Roman"/>
-          <w:b/>
-          <w:bCs/>
-          <w:sz w:val="24"/>
-          <w:szCs w:val="24"/>
-          <w:lang w:eastAsia="es-EC"/>
-        </w:rPr>
-        <w:t>Principios SOLID</w:t>
-      </w:r>
     </w:p>
     <w:p>
       <w:pPr>
@@ -4544,20 +4655,13 @@
         <w:jc w:val="both"/>
         <w:rPr>
           <w:rFonts w:ascii="Times New Roman" w:hAnsi="Times New Roman" w:cs="Times New Roman"/>
-          <w:sz w:val="24"/>
-          <w:szCs w:val="24"/>
-          <w:lang w:eastAsia="es-EC"/>
-        </w:rPr>
-      </w:pPr>
-      <w:r>
-        <w:rPr>
-          <w:rFonts w:ascii="Times New Roman" w:hAnsi="Times New Roman" w:cs="Times New Roman"/>
-          <w:sz w:val="24"/>
-          <w:szCs w:val="24"/>
-          <w:lang w:eastAsia="es-EC"/>
-        </w:rPr>
-        <w:t>SRP: El controlador valida solicitudes, la fábrica crea expedientes y el notificador envía avisos.</w:t>
-      </w:r>
+          <w:b/>
+          <w:bCs/>
+          <w:sz w:val="24"/>
+          <w:szCs w:val="24"/>
+          <w:lang w:eastAsia="es-EC"/>
+        </w:rPr>
+      </w:pPr>
     </w:p>
     <w:p>
       <w:pPr>
@@ -4565,98 +4669,13 @@
         <w:jc w:val="both"/>
         <w:rPr>
           <w:rFonts w:ascii="Times New Roman" w:hAnsi="Times New Roman" w:cs="Times New Roman"/>
-          <w:sz w:val="24"/>
-          <w:szCs w:val="24"/>
-          <w:lang w:eastAsia="es-EC"/>
-        </w:rPr>
-      </w:pPr>
-      <w:r>
-        <w:rPr>
-          <w:rFonts w:ascii="Times New Roman" w:hAnsi="Times New Roman" w:cs="Times New Roman"/>
-          <w:sz w:val="24"/>
-          <w:szCs w:val="24"/>
-          <w:lang w:eastAsia="es-EC"/>
-        </w:rPr>
-        <w:t>OCP: Se pueden agregar nuevas fábricas concretas o tipos de observadores sin modificar las abstracciones existentes.</w:t>
-      </w:r>
-    </w:p>
-    <w:p>
-      <w:pPr>
-        <w:jc w:val="both"/>
-        <w:rPr>
-          <w:rFonts w:ascii="Times New Roman" w:hAnsi="Times New Roman" w:cs="Times New Roman"/>
-          <w:sz w:val="24"/>
-          <w:szCs w:val="24"/>
-          <w:lang w:eastAsia="es-EC"/>
-        </w:rPr>
-      </w:pPr>
-      <w:r>
-        <w:rPr>
-          <w:rFonts w:ascii="Times New Roman" w:hAnsi="Times New Roman" w:cs="Times New Roman"/>
-          <w:sz w:val="24"/>
-          <w:szCs w:val="24"/>
-          <w:lang w:eastAsia="es-EC"/>
-        </w:rPr>
-        <w:lastRenderedPageBreak/>
-        <w:t>LSP</w:t>
-      </w:r>
-      <w:r>
-        <w:rPr>
-          <w:rFonts w:ascii="Times New Roman" w:hAnsi="Times New Roman" w:cs="Times New Roman"/>
-          <w:sz w:val="24"/>
-          <w:szCs w:val="24"/>
-        </w:rPr>
-        <w:t xml:space="preserve">: </w:t>
-      </w:r>
-      <w:r>
-        <w:rPr>
-          <w:rFonts w:ascii="Times New Roman" w:hAnsi="Times New Roman" w:cs="Times New Roman"/>
-          <w:sz w:val="24"/>
-          <w:szCs w:val="24"/>
-          <w:lang w:eastAsia="es-EC"/>
-        </w:rPr>
-        <w:t xml:space="preserve">Las fábricas concretas deben cumplir el contrato establecido por </w:t>
-      </w:r>
-      <w:proofErr w:type="spellStart"/>
-      <w:r>
-        <w:rPr>
-          <w:rFonts w:ascii="Times New Roman" w:hAnsi="Times New Roman" w:cs="Times New Roman"/>
-          <w:sz w:val="24"/>
-          <w:szCs w:val="24"/>
-          <w:lang w:eastAsia="es-EC"/>
-        </w:rPr>
-        <w:t>FabricaExpediente</w:t>
-      </w:r>
-      <w:proofErr w:type="spellEnd"/>
-      <w:r>
-        <w:rPr>
-          <w:rFonts w:ascii="Times New Roman" w:hAnsi="Times New Roman" w:cs="Times New Roman"/>
-          <w:sz w:val="24"/>
-          <w:szCs w:val="24"/>
-          <w:lang w:eastAsia="es-EC"/>
-        </w:rPr>
-        <w:t xml:space="preserve">, y los expedientes deben respetar el comportamiento de </w:t>
-      </w:r>
-      <w:proofErr w:type="spellStart"/>
-      <w:r>
-        <w:rPr>
-          <w:rFonts w:ascii="Times New Roman" w:hAnsi="Times New Roman" w:cs="Times New Roman"/>
-          <w:sz w:val="24"/>
-          <w:szCs w:val="24"/>
-          <w:lang w:eastAsia="es-EC"/>
-        </w:rPr>
-        <w:t>ExpedienteAnimal</w:t>
-      </w:r>
-      <w:proofErr w:type="spellEnd"/>
-      <w:r>
-        <w:rPr>
-          <w:rFonts w:ascii="Times New Roman" w:hAnsi="Times New Roman" w:cs="Times New Roman"/>
-          <w:sz w:val="24"/>
-          <w:szCs w:val="24"/>
-          <w:lang w:eastAsia="es-EC"/>
-        </w:rPr>
-        <w:t>.</w:t>
-      </w:r>
+          <w:b/>
+          <w:bCs/>
+          <w:sz w:val="24"/>
+          <w:szCs w:val="24"/>
+          <w:lang w:eastAsia="es-EC"/>
+        </w:rPr>
+      </w:pPr>
     </w:p>
     <w:p>
       <w:pPr>
@@ -4664,100 +4683,42 @@
         <w:jc w:val="both"/>
         <w:rPr>
           <w:rFonts w:ascii="Times New Roman" w:hAnsi="Times New Roman" w:cs="Times New Roman"/>
-          <w:sz w:val="24"/>
-          <w:szCs w:val="24"/>
-          <w:lang w:eastAsia="es-EC"/>
-        </w:rPr>
-      </w:pPr>
-      <w:r>
-        <w:rPr>
-          <w:rFonts w:ascii="Times New Roman" w:hAnsi="Times New Roman" w:cs="Times New Roman"/>
-          <w:sz w:val="24"/>
-          <w:szCs w:val="24"/>
-          <w:lang w:eastAsia="es-EC"/>
-        </w:rPr>
-        <w:t xml:space="preserve">ISP: La interfaz </w:t>
-      </w:r>
-      <w:proofErr w:type="spellStart"/>
-      <w:r>
-        <w:rPr>
-          <w:rFonts w:ascii="Times New Roman" w:hAnsi="Times New Roman" w:cs="Times New Roman"/>
-          <w:sz w:val="24"/>
-          <w:szCs w:val="24"/>
-          <w:lang w:eastAsia="es-EC"/>
-        </w:rPr>
-        <w:t>IObservadorNuevoCaso</w:t>
-      </w:r>
-      <w:proofErr w:type="spellEnd"/>
-      <w:r>
-        <w:rPr>
-          <w:rFonts w:ascii="Times New Roman" w:hAnsi="Times New Roman" w:cs="Times New Roman"/>
-          <w:sz w:val="24"/>
-          <w:szCs w:val="24"/>
-          <w:lang w:eastAsia="es-EC"/>
-        </w:rPr>
-        <w:t xml:space="preserve"> contiene únicamente la operación necesaria para recibir un aviso de nuevo caso.</w:t>
-      </w:r>
-    </w:p>
-    <w:p>
-      <w:pPr>
+          <w:b/>
+          <w:bCs/>
+          <w:sz w:val="24"/>
+          <w:szCs w:val="24"/>
+          <w:lang w:eastAsia="es-EC"/>
+        </w:rPr>
+      </w:pPr>
+    </w:p>
+    <w:p>
+      <w:pPr>
+        <w:pStyle w:val="Prrafodelista"/>
+        <w:numPr>
+          <w:ilvl w:val="0"/>
+          <w:numId w:val="25"/>
+        </w:numPr>
         <w:spacing w:line="360" w:lineRule="auto"/>
         <w:jc w:val="both"/>
         <w:rPr>
           <w:rFonts w:ascii="Times New Roman" w:hAnsi="Times New Roman" w:cs="Times New Roman"/>
-          <w:sz w:val="24"/>
-          <w:szCs w:val="24"/>
-          <w:lang w:eastAsia="es-EC"/>
-        </w:rPr>
-      </w:pPr>
-      <w:r>
-        <w:rPr>
-          <w:rFonts w:ascii="Times New Roman" w:hAnsi="Times New Roman" w:cs="Times New Roman"/>
-          <w:sz w:val="24"/>
-          <w:szCs w:val="24"/>
-          <w:lang w:eastAsia="es-EC"/>
-        </w:rPr>
-        <w:t xml:space="preserve">DIP: El controlador utiliza la abstracción </w:t>
-      </w:r>
-      <w:proofErr w:type="spellStart"/>
-      <w:r>
-        <w:rPr>
-          <w:rFonts w:ascii="Times New Roman" w:hAnsi="Times New Roman" w:cs="Times New Roman"/>
-          <w:sz w:val="24"/>
-          <w:szCs w:val="24"/>
-          <w:lang w:eastAsia="es-EC"/>
-        </w:rPr>
-        <w:t>FabricaExpediente</w:t>
-      </w:r>
-      <w:proofErr w:type="spellEnd"/>
-      <w:r>
-        <w:rPr>
-          <w:rFonts w:ascii="Times New Roman" w:hAnsi="Times New Roman" w:cs="Times New Roman"/>
-          <w:sz w:val="24"/>
-          <w:szCs w:val="24"/>
-          <w:lang w:eastAsia="es-EC"/>
-        </w:rPr>
-        <w:t xml:space="preserve"> y el servicio depende de </w:t>
-      </w:r>
-      <w:proofErr w:type="spellStart"/>
-      <w:r>
-        <w:rPr>
-          <w:rFonts w:ascii="Times New Roman" w:hAnsi="Times New Roman" w:cs="Times New Roman"/>
-          <w:sz w:val="24"/>
-          <w:szCs w:val="24"/>
-          <w:lang w:eastAsia="es-EC"/>
-        </w:rPr>
-        <w:t>IRepositorioCaso</w:t>
-      </w:r>
-      <w:proofErr w:type="spellEnd"/>
-      <w:r>
-        <w:rPr>
-          <w:rFonts w:ascii="Times New Roman" w:hAnsi="Times New Roman" w:cs="Times New Roman"/>
-          <w:sz w:val="24"/>
-          <w:szCs w:val="24"/>
-          <w:lang w:eastAsia="es-EC"/>
-        </w:rPr>
-        <w:t>, no de una implementación concreta.</w:t>
+          <w:b/>
+          <w:bCs/>
+          <w:sz w:val="24"/>
+          <w:szCs w:val="24"/>
+          <w:lang w:eastAsia="es-EC"/>
+        </w:rPr>
+      </w:pPr>
+      <w:r>
+        <w:rPr>
+          <w:rFonts w:ascii="Times New Roman" w:hAnsi="Times New Roman" w:cs="Times New Roman"/>
+          <w:b/>
+          <w:bCs/>
+          <w:sz w:val="24"/>
+          <w:szCs w:val="24"/>
+          <w:lang w:eastAsia="es-EC"/>
+        </w:rPr>
+        <w:t>Principios SOLID</w:t>
       </w:r>
     </w:p>
     <w:p>
@@ -4766,23 +4727,19 @@
         <w:jc w:val="both"/>
         <w:rPr>
           <w:rFonts w:ascii="Times New Roman" w:hAnsi="Times New Roman" w:cs="Times New Roman"/>
-          <w:b/>
-          <w:bCs/>
-          <w:sz w:val="24"/>
-          <w:szCs w:val="24"/>
-          <w:lang w:eastAsia="es-EC"/>
-        </w:rPr>
-      </w:pPr>
-      <w:r>
-        <w:rPr>
-          <w:rFonts w:ascii="Times New Roman" w:hAnsi="Times New Roman" w:cs="Times New Roman"/>
-          <w:b/>
-          <w:bCs/>
-          <w:sz w:val="24"/>
-          <w:szCs w:val="24"/>
-          <w:lang w:eastAsia="es-EC"/>
-        </w:rPr>
-        <w:t xml:space="preserve">Conclusiones </w:t>
+          <w:sz w:val="24"/>
+          <w:szCs w:val="24"/>
+          <w:lang w:eastAsia="es-EC"/>
+        </w:rPr>
+      </w:pPr>
+      <w:r>
+        <w:rPr>
+          <w:rFonts w:ascii="Times New Roman" w:hAnsi="Times New Roman" w:cs="Times New Roman"/>
+          <w:sz w:val="24"/>
+          <w:szCs w:val="24"/>
+          <w:lang w:eastAsia="es-EC"/>
+        </w:rPr>
+        <w:t>SRP: El controlador valida solicitudes, la fábrica crea expedientes y el notificador envía avisos.</w:t>
       </w:r>
     </w:p>
     <w:p>
@@ -4803,25 +4760,44 @@
           <w:szCs w:val="24"/>
           <w:lang w:eastAsia="es-EC"/>
         </w:rPr>
-        <w:t>El Sistema de Control de Rescate y Adopción Animal utilizará tres patrones de diseño</w:t>
-      </w:r>
-      <w:r>
-        <w:rPr>
-          <w:rFonts w:ascii="Times New Roman" w:hAnsi="Times New Roman" w:cs="Times New Roman"/>
-          <w:sz w:val="24"/>
-          <w:szCs w:val="24"/>
-          <w:lang w:eastAsia="es-EC"/>
-        </w:rPr>
-        <w:t>,</w:t>
-      </w:r>
-      <w:r>
-        <w:rPr>
-          <w:rFonts w:ascii="Times New Roman" w:hAnsi="Times New Roman" w:cs="Times New Roman"/>
-          <w:sz w:val="24"/>
-          <w:szCs w:val="24"/>
-          <w:lang w:eastAsia="es-EC"/>
-        </w:rPr>
-        <w:t xml:space="preserve"> MVC, Factory </w:t>
+        <w:t>OCP: Se pueden agregar nuevas fábricas concretas o tipos de observadores sin modificar las abstracciones existentes.</w:t>
+      </w:r>
+    </w:p>
+    <w:p>
+      <w:pPr>
+        <w:jc w:val="both"/>
+        <w:rPr>
+          <w:rFonts w:ascii="Times New Roman" w:hAnsi="Times New Roman" w:cs="Times New Roman"/>
+          <w:sz w:val="24"/>
+          <w:szCs w:val="24"/>
+          <w:lang w:eastAsia="es-EC"/>
+        </w:rPr>
+      </w:pPr>
+      <w:r>
+        <w:rPr>
+          <w:rFonts w:ascii="Times New Roman" w:hAnsi="Times New Roman" w:cs="Times New Roman"/>
+          <w:sz w:val="24"/>
+          <w:szCs w:val="24"/>
+          <w:lang w:eastAsia="es-EC"/>
+        </w:rPr>
+        <w:t>LSP</w:t>
+      </w:r>
+      <w:r>
+        <w:rPr>
+          <w:rFonts w:ascii="Times New Roman" w:hAnsi="Times New Roman" w:cs="Times New Roman"/>
+          <w:sz w:val="24"/>
+          <w:szCs w:val="24"/>
+        </w:rPr>
+        <w:t xml:space="preserve">: </w:t>
+      </w:r>
+      <w:r>
+        <w:rPr>
+          <w:rFonts w:ascii="Times New Roman" w:hAnsi="Times New Roman" w:cs="Times New Roman"/>
+          <w:sz w:val="24"/>
+          <w:szCs w:val="24"/>
+          <w:lang w:eastAsia="es-EC"/>
+        </w:rPr>
+        <w:t xml:space="preserve">Las fábricas concretas deben cumplir el contrato establecido por </w:t>
       </w:r>
       <w:proofErr w:type="spellStart"/>
       <w:r>
@@ -4831,7 +4807,7 @@
           <w:szCs w:val="24"/>
           <w:lang w:eastAsia="es-EC"/>
         </w:rPr>
-        <w:t>Method</w:t>
+        <w:t>FabricaExpediente</w:t>
       </w:r>
       <w:proofErr w:type="spellEnd"/>
       <w:r>
@@ -4841,7 +4817,7 @@
           <w:szCs w:val="24"/>
           <w:lang w:eastAsia="es-EC"/>
         </w:rPr>
-        <w:t xml:space="preserve"> y </w:t>
+        <w:t xml:space="preserve">, y los expedientes deben respetar el comportamiento de </w:t>
       </w:r>
       <w:proofErr w:type="spellStart"/>
       <w:r>
@@ -4851,7 +4827,7 @@
           <w:szCs w:val="24"/>
           <w:lang w:eastAsia="es-EC"/>
         </w:rPr>
-        <w:t>Observer</w:t>
+        <w:t>ExpedienteAnimal</w:t>
       </w:r>
       <w:proofErr w:type="spellEnd"/>
       <w:r>
@@ -4861,83 +4837,7 @@
           <w:szCs w:val="24"/>
           <w:lang w:eastAsia="es-EC"/>
         </w:rPr>
-        <w:t>. MVC permite organizar la presentación, el procesamiento y los datos</w:t>
-      </w:r>
-      <w:r>
-        <w:rPr>
-          <w:rFonts w:ascii="Times New Roman" w:hAnsi="Times New Roman" w:cs="Times New Roman"/>
-          <w:sz w:val="24"/>
-          <w:szCs w:val="24"/>
-          <w:lang w:eastAsia="es-EC"/>
-        </w:rPr>
-        <w:t>, mientras que</w:t>
-      </w:r>
-      <w:r>
-        <w:rPr>
-          <w:rFonts w:ascii="Times New Roman" w:hAnsi="Times New Roman" w:cs="Times New Roman"/>
-          <w:sz w:val="24"/>
-          <w:szCs w:val="24"/>
-          <w:lang w:eastAsia="es-EC"/>
-        </w:rPr>
-        <w:t xml:space="preserve"> Factory </w:t>
-      </w:r>
-      <w:proofErr w:type="spellStart"/>
-      <w:r>
-        <w:rPr>
-          <w:rFonts w:ascii="Times New Roman" w:hAnsi="Times New Roman" w:cs="Times New Roman"/>
-          <w:sz w:val="24"/>
-          <w:szCs w:val="24"/>
-          <w:lang w:eastAsia="es-EC"/>
-        </w:rPr>
-        <w:t>Method</w:t>
-      </w:r>
-      <w:proofErr w:type="spellEnd"/>
-      <w:r>
-        <w:rPr>
-          <w:rFonts w:ascii="Times New Roman" w:hAnsi="Times New Roman" w:cs="Times New Roman"/>
-          <w:sz w:val="24"/>
-          <w:szCs w:val="24"/>
-          <w:lang w:eastAsia="es-EC"/>
-        </w:rPr>
-        <w:t xml:space="preserve"> facilita crear expedientes específicos para perros y gatos</w:t>
-      </w:r>
-      <w:r>
-        <w:rPr>
-          <w:rFonts w:ascii="Times New Roman" w:hAnsi="Times New Roman" w:cs="Times New Roman"/>
-          <w:sz w:val="24"/>
-          <w:szCs w:val="24"/>
-          <w:lang w:eastAsia="es-EC"/>
-        </w:rPr>
-        <w:t>,</w:t>
-      </w:r>
-      <w:r>
-        <w:rPr>
-          <w:rFonts w:ascii="Times New Roman" w:hAnsi="Times New Roman" w:cs="Times New Roman"/>
-          <w:sz w:val="24"/>
-          <w:szCs w:val="24"/>
-          <w:lang w:eastAsia="es-EC"/>
-        </w:rPr>
-        <w:t xml:space="preserve"> y </w:t>
-      </w:r>
-      <w:proofErr w:type="spellStart"/>
-      <w:r>
-        <w:rPr>
-          <w:rFonts w:ascii="Times New Roman" w:hAnsi="Times New Roman" w:cs="Times New Roman"/>
-          <w:sz w:val="24"/>
-          <w:szCs w:val="24"/>
-          <w:lang w:eastAsia="es-EC"/>
-        </w:rPr>
-        <w:t>Observer</w:t>
-      </w:r>
-      <w:proofErr w:type="spellEnd"/>
-      <w:r>
-        <w:rPr>
-          <w:rFonts w:ascii="Times New Roman" w:hAnsi="Times New Roman" w:cs="Times New Roman"/>
-          <w:sz w:val="24"/>
-          <w:szCs w:val="24"/>
-          <w:lang w:eastAsia="es-EC"/>
-        </w:rPr>
-        <w:t xml:space="preserve"> permite comunicar automáticamente los nuevos casos a los voluntarios.</w:t>
+        <w:t>.</w:t>
       </w:r>
     </w:p>
     <w:p>
@@ -4958,6 +4858,1215 @@
           <w:szCs w:val="24"/>
           <w:lang w:eastAsia="es-EC"/>
         </w:rPr>
+        <w:t xml:space="preserve">ISP: La interfaz </w:t>
+      </w:r>
+      <w:proofErr w:type="spellStart"/>
+      <w:r>
+        <w:rPr>
+          <w:rFonts w:ascii="Times New Roman" w:hAnsi="Times New Roman" w:cs="Times New Roman"/>
+          <w:sz w:val="24"/>
+          <w:szCs w:val="24"/>
+          <w:lang w:eastAsia="es-EC"/>
+        </w:rPr>
+        <w:t>IObservadorNuevoCaso</w:t>
+      </w:r>
+      <w:proofErr w:type="spellEnd"/>
+      <w:r>
+        <w:rPr>
+          <w:rFonts w:ascii="Times New Roman" w:hAnsi="Times New Roman" w:cs="Times New Roman"/>
+          <w:sz w:val="24"/>
+          <w:szCs w:val="24"/>
+          <w:lang w:eastAsia="es-EC"/>
+        </w:rPr>
+        <w:t xml:space="preserve"> contiene únicamente la operación necesaria para recibir un aviso de nuevo caso.</w:t>
+      </w:r>
+    </w:p>
+    <w:p>
+      <w:pPr>
+        <w:spacing w:line="360" w:lineRule="auto"/>
+        <w:jc w:val="both"/>
+        <w:rPr>
+          <w:rFonts w:ascii="Times New Roman" w:hAnsi="Times New Roman" w:cs="Times New Roman"/>
+          <w:sz w:val="24"/>
+          <w:szCs w:val="24"/>
+          <w:lang w:eastAsia="es-EC"/>
+        </w:rPr>
+      </w:pPr>
+      <w:r>
+        <w:rPr>
+          <w:rFonts w:ascii="Times New Roman" w:hAnsi="Times New Roman" w:cs="Times New Roman"/>
+          <w:sz w:val="24"/>
+          <w:szCs w:val="24"/>
+          <w:lang w:eastAsia="es-EC"/>
+        </w:rPr>
+        <w:t xml:space="preserve">DIP: El controlador utiliza la abstracción </w:t>
+      </w:r>
+      <w:proofErr w:type="spellStart"/>
+      <w:r>
+        <w:rPr>
+          <w:rFonts w:ascii="Times New Roman" w:hAnsi="Times New Roman" w:cs="Times New Roman"/>
+          <w:sz w:val="24"/>
+          <w:szCs w:val="24"/>
+          <w:lang w:eastAsia="es-EC"/>
+        </w:rPr>
+        <w:t>FabricaExpediente</w:t>
+      </w:r>
+      <w:proofErr w:type="spellEnd"/>
+      <w:r>
+        <w:rPr>
+          <w:rFonts w:ascii="Times New Roman" w:hAnsi="Times New Roman" w:cs="Times New Roman"/>
+          <w:sz w:val="24"/>
+          <w:szCs w:val="24"/>
+          <w:lang w:eastAsia="es-EC"/>
+        </w:rPr>
+        <w:t xml:space="preserve"> y el servicio depende de </w:t>
+      </w:r>
+      <w:proofErr w:type="spellStart"/>
+      <w:r>
+        <w:rPr>
+          <w:rFonts w:ascii="Times New Roman" w:hAnsi="Times New Roman" w:cs="Times New Roman"/>
+          <w:sz w:val="24"/>
+          <w:szCs w:val="24"/>
+          <w:lang w:eastAsia="es-EC"/>
+        </w:rPr>
+        <w:t>IRepositorioCaso</w:t>
+      </w:r>
+      <w:proofErr w:type="spellEnd"/>
+      <w:r>
+        <w:rPr>
+          <w:rFonts w:ascii="Times New Roman" w:hAnsi="Times New Roman" w:cs="Times New Roman"/>
+          <w:sz w:val="24"/>
+          <w:szCs w:val="24"/>
+          <w:lang w:eastAsia="es-EC"/>
+        </w:rPr>
+        <w:t>, no de una implementación concreta.</w:t>
+      </w:r>
+    </w:p>
+    <w:p>
+      <w:pPr>
+        <w:spacing w:line="360" w:lineRule="auto"/>
+        <w:jc w:val="both"/>
+        <w:rPr>
+          <w:rFonts w:ascii="Times New Roman" w:hAnsi="Times New Roman" w:cs="Times New Roman"/>
+          <w:sz w:val="24"/>
+          <w:szCs w:val="24"/>
+          <w:lang w:eastAsia="es-EC"/>
+        </w:rPr>
+      </w:pPr>
+    </w:p>
+    <w:p>
+      <w:pPr>
+        <w:pStyle w:val="Prrafodelista"/>
+        <w:numPr>
+          <w:ilvl w:val="0"/>
+          <w:numId w:val="25"/>
+        </w:numPr>
+        <w:spacing w:line="360" w:lineRule="auto"/>
+        <w:jc w:val="both"/>
+        <w:rPr>
+          <w:rFonts w:ascii="Times New Roman" w:hAnsi="Times New Roman" w:cs="Times New Roman"/>
+          <w:b/>
+          <w:bCs/>
+          <w:sz w:val="24"/>
+          <w:szCs w:val="24"/>
+          <w:lang w:eastAsia="es-EC"/>
+        </w:rPr>
+      </w:pPr>
+      <w:proofErr w:type="spellStart"/>
+      <w:r>
+        <w:rPr>
+          <w:rFonts w:ascii="Times New Roman" w:hAnsi="Times New Roman" w:cs="Times New Roman"/>
+          <w:b/>
+          <w:bCs/>
+          <w:sz w:val="24"/>
+          <w:szCs w:val="24"/>
+          <w:lang w:eastAsia="es-EC"/>
+        </w:rPr>
+        <w:t>Justificacion</w:t>
+      </w:r>
+      <w:proofErr w:type="spellEnd"/>
+      <w:r>
+        <w:rPr>
+          <w:rFonts w:ascii="Times New Roman" w:hAnsi="Times New Roman" w:cs="Times New Roman"/>
+          <w:b/>
+          <w:bCs/>
+          <w:sz w:val="24"/>
+          <w:szCs w:val="24"/>
+          <w:lang w:eastAsia="es-EC"/>
+        </w:rPr>
+        <w:t xml:space="preserve"> de </w:t>
+      </w:r>
+      <w:proofErr w:type="spellStart"/>
+      <w:r>
+        <w:rPr>
+          <w:rFonts w:ascii="Times New Roman" w:hAnsi="Times New Roman" w:cs="Times New Roman"/>
+          <w:b/>
+          <w:bCs/>
+          <w:sz w:val="24"/>
+          <w:szCs w:val="24"/>
+          <w:lang w:eastAsia="es-EC"/>
+        </w:rPr>
+        <w:t>Gitflow</w:t>
+      </w:r>
+      <w:proofErr w:type="spellEnd"/>
+    </w:p>
+    <w:p>
+      <w:pPr>
+        <w:spacing w:line="360" w:lineRule="auto"/>
+        <w:jc w:val="both"/>
+        <w:rPr>
+          <w:rFonts w:ascii="Times New Roman" w:hAnsi="Times New Roman" w:cs="Times New Roman"/>
+          <w:sz w:val="24"/>
+          <w:szCs w:val="24"/>
+          <w:lang w:eastAsia="es-EC"/>
+        </w:rPr>
+      </w:pPr>
+      <w:r>
+        <w:rPr>
+          <w:rFonts w:ascii="Times New Roman" w:hAnsi="Times New Roman" w:cs="Times New Roman"/>
+          <w:sz w:val="24"/>
+          <w:szCs w:val="24"/>
+          <w:lang w:eastAsia="es-EC"/>
+        </w:rPr>
+        <w:t>Es una</w:t>
+      </w:r>
+      <w:r>
+        <w:rPr>
+          <w:rFonts w:ascii="Times New Roman" w:hAnsi="Times New Roman" w:cs="Times New Roman"/>
+          <w:sz w:val="24"/>
+          <w:szCs w:val="24"/>
+          <w:lang w:eastAsia="es-EC"/>
+        </w:rPr>
+        <w:t xml:space="preserve"> estrategia de organización y control de versiones, ya que permite mantener el código ordenado y facilitar el trabajo durante las diferentes etapas del proyecto.</w:t>
+      </w:r>
+    </w:p>
+    <w:p>
+      <w:pPr>
+        <w:spacing w:line="360" w:lineRule="auto"/>
+        <w:jc w:val="both"/>
+        <w:rPr>
+          <w:rFonts w:ascii="Times New Roman" w:hAnsi="Times New Roman" w:cs="Times New Roman"/>
+          <w:sz w:val="24"/>
+          <w:szCs w:val="24"/>
+          <w:lang w:eastAsia="es-EC"/>
+        </w:rPr>
+      </w:pPr>
+      <w:r>
+        <w:rPr>
+          <w:rFonts w:ascii="Times New Roman" w:hAnsi="Times New Roman" w:cs="Times New Roman"/>
+          <w:sz w:val="24"/>
+          <w:szCs w:val="24"/>
+          <w:lang w:eastAsia="es-EC"/>
+        </w:rPr>
+        <w:t xml:space="preserve">La rama master almacenará las versiones estables del sistema, mientras que la rama </w:t>
+      </w:r>
+      <w:proofErr w:type="spellStart"/>
+      <w:r>
+        <w:rPr>
+          <w:rFonts w:ascii="Times New Roman" w:hAnsi="Times New Roman" w:cs="Times New Roman"/>
+          <w:sz w:val="24"/>
+          <w:szCs w:val="24"/>
+          <w:lang w:eastAsia="es-EC"/>
+        </w:rPr>
+        <w:t>develop</w:t>
+      </w:r>
+      <w:proofErr w:type="spellEnd"/>
+      <w:r>
+        <w:rPr>
+          <w:rFonts w:ascii="Times New Roman" w:hAnsi="Times New Roman" w:cs="Times New Roman"/>
+          <w:sz w:val="24"/>
+          <w:szCs w:val="24"/>
+          <w:lang w:eastAsia="es-EC"/>
+        </w:rPr>
+        <w:t xml:space="preserve"> integrará los avances antes de incorporarlos a la versión final</w:t>
+      </w:r>
+      <w:r>
+        <w:rPr>
+          <w:rFonts w:ascii="Times New Roman" w:hAnsi="Times New Roman" w:cs="Times New Roman"/>
+          <w:sz w:val="24"/>
+          <w:szCs w:val="24"/>
+          <w:lang w:eastAsia="es-EC"/>
+        </w:rPr>
+        <w:t xml:space="preserve">, </w:t>
+      </w:r>
+      <w:r>
+        <w:rPr>
+          <w:rFonts w:ascii="Times New Roman" w:hAnsi="Times New Roman" w:cs="Times New Roman"/>
+          <w:sz w:val="24"/>
+          <w:szCs w:val="24"/>
+          <w:lang w:eastAsia="es-EC"/>
+        </w:rPr>
+        <w:t xml:space="preserve">se utilizarán ramas </w:t>
+      </w:r>
+      <w:proofErr w:type="spellStart"/>
+      <w:r>
+        <w:rPr>
+          <w:rFonts w:ascii="Times New Roman" w:hAnsi="Times New Roman" w:cs="Times New Roman"/>
+          <w:sz w:val="24"/>
+          <w:szCs w:val="24"/>
+          <w:lang w:eastAsia="es-EC"/>
+        </w:rPr>
+        <w:t>feature</w:t>
+      </w:r>
+      <w:proofErr w:type="spellEnd"/>
+      <w:r>
+        <w:rPr>
+          <w:rFonts w:ascii="Times New Roman" w:hAnsi="Times New Roman" w:cs="Times New Roman"/>
+          <w:sz w:val="24"/>
+          <w:szCs w:val="24"/>
+          <w:lang w:eastAsia="es-EC"/>
+        </w:rPr>
+        <w:t>/ para desarrollar funcionalidades específicas, como el registro de casos de rescate, la gestión de expedientes de perros y gatos y las solicitudes de adopción, sin modificar directamente el código establ</w:t>
+      </w:r>
+      <w:r>
+        <w:rPr>
+          <w:rFonts w:ascii="Times New Roman" w:hAnsi="Times New Roman" w:cs="Times New Roman"/>
+          <w:sz w:val="24"/>
+          <w:szCs w:val="24"/>
+          <w:lang w:eastAsia="es-EC"/>
+        </w:rPr>
+        <w:t>e, e</w:t>
+      </w:r>
+      <w:r>
+        <w:rPr>
+          <w:rFonts w:ascii="Times New Roman" w:hAnsi="Times New Roman" w:cs="Times New Roman"/>
+          <w:sz w:val="24"/>
+          <w:szCs w:val="24"/>
+          <w:lang w:eastAsia="es-EC"/>
+        </w:rPr>
+        <w:t xml:space="preserve">sta organización permite identificar los cambios realizados, corregir errores con mayor facilidad, revisar las modificaciones antes de integrarlas y mantener un historial de las versiones del proyecto en GitHub. De esta manera, </w:t>
+      </w:r>
+      <w:proofErr w:type="spellStart"/>
+      <w:r>
+        <w:rPr>
+          <w:rFonts w:ascii="Times New Roman" w:hAnsi="Times New Roman" w:cs="Times New Roman"/>
+          <w:sz w:val="24"/>
+          <w:szCs w:val="24"/>
+          <w:lang w:eastAsia="es-EC"/>
+        </w:rPr>
+        <w:t>Gitflow</w:t>
+      </w:r>
+      <w:proofErr w:type="spellEnd"/>
+      <w:r>
+        <w:rPr>
+          <w:rFonts w:ascii="Times New Roman" w:hAnsi="Times New Roman" w:cs="Times New Roman"/>
+          <w:sz w:val="24"/>
+          <w:szCs w:val="24"/>
+          <w:lang w:eastAsia="es-EC"/>
+        </w:rPr>
+        <w:t xml:space="preserve"> contribuye a la mantenibilidad, trazabilidad de versiones y recuperación ante fallo</w:t>
+      </w:r>
+      <w:r>
+        <w:rPr>
+          <w:rFonts w:ascii="Times New Roman" w:hAnsi="Times New Roman" w:cs="Times New Roman"/>
+          <w:sz w:val="24"/>
+          <w:szCs w:val="24"/>
+          <w:lang w:eastAsia="es-EC"/>
+        </w:rPr>
+        <w:t xml:space="preserve"> en un futuro, en esta primera actividad todos los detalles del análisis del caso se encuentran en el documento </w:t>
+      </w:r>
+      <w:proofErr w:type="spellStart"/>
+      <w:r>
+        <w:rPr>
+          <w:rFonts w:ascii="Times New Roman" w:hAnsi="Times New Roman" w:cs="Times New Roman"/>
+          <w:sz w:val="24"/>
+          <w:szCs w:val="24"/>
+          <w:lang w:eastAsia="es-EC"/>
+        </w:rPr>
+        <w:t>pdf</w:t>
+      </w:r>
+      <w:proofErr w:type="spellEnd"/>
+      <w:r>
+        <w:rPr>
+          <w:rFonts w:ascii="Times New Roman" w:hAnsi="Times New Roman" w:cs="Times New Roman"/>
+          <w:sz w:val="24"/>
+          <w:szCs w:val="24"/>
+          <w:lang w:eastAsia="es-EC"/>
+        </w:rPr>
+        <w:t>.</w:t>
+      </w:r>
+    </w:p>
+    <w:p>
+      <w:pPr>
+        <w:spacing w:line="360" w:lineRule="auto"/>
+        <w:jc w:val="both"/>
+        <w:rPr>
+          <w:rFonts w:ascii="Times New Roman" w:hAnsi="Times New Roman" w:cs="Times New Roman"/>
+          <w:sz w:val="24"/>
+          <w:szCs w:val="24"/>
+          <w:lang w:eastAsia="es-EC"/>
+        </w:rPr>
+      </w:pPr>
+      <w:r>
+        <w:rPr>
+          <w:rFonts w:ascii="Times New Roman" w:hAnsi="Times New Roman" w:cs="Times New Roman"/>
+          <w:noProof/>
+          <w:sz w:val="24"/>
+          <w:szCs w:val="24"/>
+          <w:lang w:eastAsia="es-EC"/>
+        </w:rPr>
+        <w:drawing>
+          <wp:inline distT="0" distB="0" distL="0" distR="0" wp14:anchorId="016E8CF4" wp14:editId="3B329B5C">
+            <wp:extent cx="5001260" cy="4655820"/>
+            <wp:effectExtent l="0" t="0" r="8890" b="0"/>
+            <wp:docPr id="5" name="Imagen 5"/>
+            <wp:cNvGraphicFramePr>
+              <a:graphicFrameLocks xmlns:a="http://schemas.openxmlformats.org/drawingml/2006/main" noChangeAspect="1"/>
+            </wp:cNvGraphicFramePr>
+            <a:graphic xmlns:a="http://schemas.openxmlformats.org/drawingml/2006/main">
+              <a:graphicData uri="http://schemas.openxmlformats.org/drawingml/2006/picture">
+                <pic:pic xmlns:pic="http://schemas.openxmlformats.org/drawingml/2006/picture">
+                  <pic:nvPicPr>
+                    <pic:cNvPr id="5" name="Imagen 5"/>
+                    <pic:cNvPicPr/>
+                  </pic:nvPicPr>
+                  <pic:blipFill rotWithShape="1">
+                    <a:blip r:embed="rId19">
+                      <a:extLst>
+                        <a:ext uri="{28A0092B-C50C-407E-A947-70E740481C1C}">
+                          <a14:useLocalDpi xmlns:a14="http://schemas.microsoft.com/office/drawing/2010/main" val="0"/>
+                        </a:ext>
+                      </a:extLst>
+                    </a:blip>
+                    <a:srcRect b="5698"/>
+                    <a:stretch/>
+                  </pic:blipFill>
+                  <pic:spPr bwMode="auto">
+                    <a:xfrm>
+                      <a:off x="0" y="0"/>
+                      <a:ext cx="5005212" cy="4659499"/>
+                    </a:xfrm>
+                    <a:prstGeom prst="rect">
+                      <a:avLst/>
+                    </a:prstGeom>
+                    <a:ln>
+                      <a:noFill/>
+                    </a:ln>
+                    <a:extLst>
+                      <a:ext uri="{53640926-AAD7-44D8-BBD7-CCE9431645EC}">
+                        <a14:shadowObscured xmlns:a14="http://schemas.microsoft.com/office/drawing/2010/main"/>
+                      </a:ext>
+                    </a:extLst>
+                  </pic:spPr>
+                </pic:pic>
+              </a:graphicData>
+            </a:graphic>
+          </wp:inline>
+        </w:drawing>
+      </w:r>
+    </w:p>
+    <w:p>
+      <w:pPr>
+        <w:pStyle w:val="Prrafodelista"/>
+        <w:numPr>
+          <w:ilvl w:val="0"/>
+          <w:numId w:val="25"/>
+        </w:numPr>
+        <w:spacing w:line="360" w:lineRule="auto"/>
+        <w:jc w:val="both"/>
+        <w:rPr>
+          <w:rFonts w:ascii="Times New Roman" w:hAnsi="Times New Roman" w:cs="Times New Roman"/>
+          <w:b/>
+          <w:bCs/>
+          <w:sz w:val="24"/>
+          <w:szCs w:val="24"/>
+          <w:lang w:eastAsia="es-EC"/>
+        </w:rPr>
+      </w:pPr>
+      <w:r>
+        <w:rPr>
+          <w:rFonts w:ascii="Times New Roman" w:hAnsi="Times New Roman" w:cs="Times New Roman"/>
+          <w:b/>
+          <w:bCs/>
+          <w:sz w:val="24"/>
+          <w:szCs w:val="24"/>
+          <w:lang w:eastAsia="es-EC"/>
+        </w:rPr>
+        <w:t>Registro de avance usando COMMITS</w:t>
+      </w:r>
+    </w:p>
+    <w:p>
+      <w:pPr>
+        <w:spacing w:line="360" w:lineRule="auto"/>
+        <w:jc w:val="both"/>
+        <w:rPr>
+          <w:rFonts w:ascii="Times New Roman" w:hAnsi="Times New Roman" w:cs="Times New Roman"/>
+          <w:sz w:val="24"/>
+          <w:szCs w:val="24"/>
+          <w:lang w:eastAsia="es-EC"/>
+        </w:rPr>
+      </w:pPr>
+      <w:r>
+        <w:rPr>
+          <w:rFonts w:ascii="Times New Roman" w:hAnsi="Times New Roman" w:cs="Times New Roman"/>
+          <w:sz w:val="24"/>
+          <w:szCs w:val="24"/>
+          <w:lang w:eastAsia="es-EC"/>
+        </w:rPr>
+        <w:t xml:space="preserve">Realizamos la preparación y la creación del proyecto, y subimos nuestro primer archivo usando </w:t>
+      </w:r>
+      <w:proofErr w:type="spellStart"/>
+      <w:r>
+        <w:rPr>
+          <w:rFonts w:ascii="Times New Roman" w:hAnsi="Times New Roman" w:cs="Times New Roman"/>
+          <w:sz w:val="24"/>
+          <w:szCs w:val="24"/>
+          <w:lang w:eastAsia="es-EC"/>
+        </w:rPr>
+        <w:t>git</w:t>
+      </w:r>
+      <w:proofErr w:type="spellEnd"/>
+      <w:r>
+        <w:rPr>
+          <w:rFonts w:ascii="Times New Roman" w:hAnsi="Times New Roman" w:cs="Times New Roman"/>
+          <w:sz w:val="24"/>
+          <w:szCs w:val="24"/>
+          <w:lang w:eastAsia="es-EC"/>
+        </w:rPr>
+        <w:t xml:space="preserve"> </w:t>
+      </w:r>
+      <w:proofErr w:type="spellStart"/>
+      <w:proofErr w:type="gramStart"/>
+      <w:r>
+        <w:rPr>
+          <w:rFonts w:ascii="Times New Roman" w:hAnsi="Times New Roman" w:cs="Times New Roman"/>
+          <w:sz w:val="24"/>
+          <w:szCs w:val="24"/>
+          <w:lang w:eastAsia="es-EC"/>
+        </w:rPr>
+        <w:t>add</w:t>
+      </w:r>
+      <w:proofErr w:type="spellEnd"/>
+      <w:r>
+        <w:rPr>
+          <w:rFonts w:ascii="Times New Roman" w:hAnsi="Times New Roman" w:cs="Times New Roman"/>
+          <w:sz w:val="24"/>
+          <w:szCs w:val="24"/>
+          <w:lang w:eastAsia="es-EC"/>
+        </w:rPr>
+        <w:t xml:space="preserve"> .</w:t>
+      </w:r>
+      <w:proofErr w:type="gramEnd"/>
+      <w:r>
+        <w:rPr>
+          <w:rFonts w:ascii="Times New Roman" w:hAnsi="Times New Roman" w:cs="Times New Roman"/>
+          <w:sz w:val="24"/>
+          <w:szCs w:val="24"/>
+          <w:lang w:eastAsia="es-EC"/>
+        </w:rPr>
+        <w:t xml:space="preserve"> y </w:t>
+      </w:r>
+      <w:proofErr w:type="spellStart"/>
+      <w:r>
+        <w:rPr>
+          <w:rFonts w:ascii="Times New Roman" w:hAnsi="Times New Roman" w:cs="Times New Roman"/>
+          <w:sz w:val="24"/>
+          <w:szCs w:val="24"/>
+          <w:lang w:eastAsia="es-EC"/>
+        </w:rPr>
+        <w:t>git</w:t>
+      </w:r>
+      <w:proofErr w:type="spellEnd"/>
+      <w:r>
+        <w:rPr>
+          <w:rFonts w:ascii="Times New Roman" w:hAnsi="Times New Roman" w:cs="Times New Roman"/>
+          <w:sz w:val="24"/>
+          <w:szCs w:val="24"/>
+          <w:lang w:eastAsia="es-EC"/>
+        </w:rPr>
+        <w:t xml:space="preserve"> </w:t>
+      </w:r>
+      <w:proofErr w:type="spellStart"/>
+      <w:r>
+        <w:rPr>
+          <w:rFonts w:ascii="Times New Roman" w:hAnsi="Times New Roman" w:cs="Times New Roman"/>
+          <w:sz w:val="24"/>
+          <w:szCs w:val="24"/>
+          <w:lang w:eastAsia="es-EC"/>
+        </w:rPr>
+        <w:t>commit</w:t>
+      </w:r>
+      <w:proofErr w:type="spellEnd"/>
+      <w:r>
+        <w:rPr>
+          <w:rFonts w:ascii="Times New Roman" w:hAnsi="Times New Roman" w:cs="Times New Roman"/>
+          <w:sz w:val="24"/>
+          <w:szCs w:val="24"/>
+          <w:lang w:eastAsia="es-EC"/>
+        </w:rPr>
+        <w:t xml:space="preserve"> </w:t>
+      </w:r>
+    </w:p>
+    <w:p>
+      <w:pPr>
+        <w:spacing w:line="360" w:lineRule="auto"/>
+        <w:jc w:val="center"/>
+        <w:rPr>
+          <w:rFonts w:ascii="Times New Roman" w:hAnsi="Times New Roman" w:cs="Times New Roman"/>
+          <w:b/>
+          <w:bCs/>
+          <w:sz w:val="24"/>
+          <w:szCs w:val="24"/>
+          <w:lang w:eastAsia="es-EC"/>
+        </w:rPr>
+      </w:pPr>
+      <w:r>
+        <w:rPr>
+          <w:rFonts w:ascii="Times New Roman" w:hAnsi="Times New Roman" w:cs="Times New Roman"/>
+          <w:b/>
+          <w:bCs/>
+          <w:noProof/>
+          <w:sz w:val="24"/>
+          <w:szCs w:val="24"/>
+          <w:lang w:eastAsia="es-EC"/>
+        </w:rPr>
+        <w:drawing>
+          <wp:inline distT="0" distB="0" distL="0" distR="0" wp14:anchorId="733F5A73" wp14:editId="2AF8C31A">
+            <wp:extent cx="4282440" cy="2140884"/>
+            <wp:effectExtent l="0" t="0" r="3810" b="0"/>
+            <wp:docPr id="10" name="Imagen 10" descr="Texto&#10;&#10;El contenido generado por IA puede ser incorrecto."/>
+            <wp:cNvGraphicFramePr>
+              <a:graphicFrameLocks xmlns:a="http://schemas.openxmlformats.org/drawingml/2006/main" noChangeAspect="1"/>
+            </wp:cNvGraphicFramePr>
+            <a:graphic xmlns:a="http://schemas.openxmlformats.org/drawingml/2006/main">
+              <a:graphicData uri="http://schemas.openxmlformats.org/drawingml/2006/picture">
+                <pic:pic xmlns:pic="http://schemas.openxmlformats.org/drawingml/2006/picture">
+                  <pic:nvPicPr>
+                    <pic:cNvPr id="10" name="Imagen 10" descr="Texto&#10;&#10;El contenido generado por IA puede ser incorrecto."/>
+                    <pic:cNvPicPr/>
+                  </pic:nvPicPr>
+                  <pic:blipFill rotWithShape="1">
+                    <a:blip r:embed="rId20">
+                      <a:extLst>
+                        <a:ext uri="{28A0092B-C50C-407E-A947-70E740481C1C}">
+                          <a14:useLocalDpi xmlns:a14="http://schemas.microsoft.com/office/drawing/2010/main" val="0"/>
+                        </a:ext>
+                      </a:extLst>
+                    </a:blip>
+                    <a:srcRect t="22378"/>
+                    <a:stretch/>
+                  </pic:blipFill>
+                  <pic:spPr bwMode="auto">
+                    <a:xfrm>
+                      <a:off x="0" y="0"/>
+                      <a:ext cx="4304338" cy="2151831"/>
+                    </a:xfrm>
+                    <a:prstGeom prst="rect">
+                      <a:avLst/>
+                    </a:prstGeom>
+                    <a:ln>
+                      <a:noFill/>
+                    </a:ln>
+                    <a:extLst>
+                      <a:ext uri="{53640926-AAD7-44D8-BBD7-CCE9431645EC}">
+                        <a14:shadowObscured xmlns:a14="http://schemas.microsoft.com/office/drawing/2010/main"/>
+                      </a:ext>
+                    </a:extLst>
+                  </pic:spPr>
+                </pic:pic>
+              </a:graphicData>
+            </a:graphic>
+          </wp:inline>
+        </w:drawing>
+      </w:r>
+    </w:p>
+    <w:p>
+      <w:pPr>
+        <w:spacing w:line="360" w:lineRule="auto"/>
+        <w:jc w:val="center"/>
+        <w:rPr>
+          <w:rFonts w:ascii="Times New Roman" w:hAnsi="Times New Roman" w:cs="Times New Roman"/>
+          <w:b/>
+          <w:bCs/>
+          <w:sz w:val="24"/>
+          <w:szCs w:val="24"/>
+          <w:lang w:eastAsia="es-EC"/>
+        </w:rPr>
+      </w:pPr>
+    </w:p>
+    <w:p>
+      <w:pPr>
+        <w:spacing w:line="360" w:lineRule="auto"/>
+        <w:rPr>
+          <w:rFonts w:ascii="Times New Roman" w:hAnsi="Times New Roman" w:cs="Times New Roman"/>
+          <w:sz w:val="24"/>
+          <w:szCs w:val="24"/>
+          <w:lang w:eastAsia="es-EC"/>
+        </w:rPr>
+      </w:pPr>
+      <w:r>
+        <w:rPr>
+          <w:rFonts w:ascii="Times New Roman" w:hAnsi="Times New Roman" w:cs="Times New Roman"/>
+          <w:sz w:val="24"/>
+          <w:szCs w:val="24"/>
+          <w:lang w:eastAsia="es-EC"/>
+        </w:rPr>
+        <w:t>Nos registramos correctamente con nuestra cuenta de GitHub usando token</w:t>
+      </w:r>
+    </w:p>
+    <w:p>
+      <w:pPr>
+        <w:spacing w:line="360" w:lineRule="auto"/>
+        <w:jc w:val="center"/>
+        <w:rPr>
+          <w:rFonts w:ascii="Times New Roman" w:hAnsi="Times New Roman" w:cs="Times New Roman"/>
+          <w:b/>
+          <w:bCs/>
+          <w:sz w:val="24"/>
+          <w:szCs w:val="24"/>
+          <w:lang w:eastAsia="es-EC"/>
+        </w:rPr>
+      </w:pPr>
+      <w:r>
+        <w:rPr>
+          <w:rFonts w:ascii="Times New Roman" w:hAnsi="Times New Roman" w:cs="Times New Roman"/>
+          <w:b/>
+          <w:bCs/>
+          <w:noProof/>
+          <w:sz w:val="24"/>
+          <w:szCs w:val="24"/>
+          <w:lang w:eastAsia="es-EC"/>
+        </w:rPr>
+        <w:drawing>
+          <wp:inline distT="0" distB="0" distL="0" distR="0" wp14:anchorId="4AD32152" wp14:editId="2EB4A7AB">
+            <wp:extent cx="4153600" cy="4392930"/>
+            <wp:effectExtent l="0" t="0" r="0" b="7620"/>
+            <wp:docPr id="9" name="Imagen 9" descr="Interfaz de usuario gráfica, Texto&#10;&#10;El contenido generado por IA puede ser incorrecto."/>
+            <wp:cNvGraphicFramePr>
+              <a:graphicFrameLocks xmlns:a="http://schemas.openxmlformats.org/drawingml/2006/main" noChangeAspect="1"/>
+            </wp:cNvGraphicFramePr>
+            <a:graphic xmlns:a="http://schemas.openxmlformats.org/drawingml/2006/main">
+              <a:graphicData uri="http://schemas.openxmlformats.org/drawingml/2006/picture">
+                <pic:pic xmlns:pic="http://schemas.openxmlformats.org/drawingml/2006/picture">
+                  <pic:nvPicPr>
+                    <pic:cNvPr id="9" name="Imagen 9" descr="Interfaz de usuario gráfica, Texto&#10;&#10;El contenido generado por IA puede ser incorrecto."/>
+                    <pic:cNvPicPr/>
+                  </pic:nvPicPr>
+                  <pic:blipFill>
+                    <a:blip r:embed="rId21">
+                      <a:extLst>
+                        <a:ext uri="{28A0092B-C50C-407E-A947-70E740481C1C}">
+                          <a14:useLocalDpi xmlns:a14="http://schemas.microsoft.com/office/drawing/2010/main" val="0"/>
+                        </a:ext>
+                      </a:extLst>
+                    </a:blip>
+                    <a:stretch>
+                      <a:fillRect/>
+                    </a:stretch>
+                  </pic:blipFill>
+                  <pic:spPr>
+                    <a:xfrm>
+                      <a:off x="0" y="0"/>
+                      <a:ext cx="4154940" cy="4394347"/>
+                    </a:xfrm>
+                    <a:prstGeom prst="rect">
+                      <a:avLst/>
+                    </a:prstGeom>
+                  </pic:spPr>
+                </pic:pic>
+              </a:graphicData>
+            </a:graphic>
+          </wp:inline>
+        </w:drawing>
+      </w:r>
+    </w:p>
+    <w:p>
+      <w:pPr>
+        <w:spacing w:line="360" w:lineRule="auto"/>
+        <w:rPr>
+          <w:rFonts w:ascii="Times New Roman" w:hAnsi="Times New Roman" w:cs="Times New Roman"/>
+          <w:sz w:val="24"/>
+          <w:szCs w:val="24"/>
+          <w:lang w:eastAsia="es-EC"/>
+        </w:rPr>
+      </w:pPr>
+      <w:r>
+        <w:rPr>
+          <w:rFonts w:ascii="Times New Roman" w:hAnsi="Times New Roman" w:cs="Times New Roman"/>
+          <w:sz w:val="24"/>
+          <w:szCs w:val="24"/>
+          <w:lang w:eastAsia="es-EC"/>
+        </w:rPr>
+        <w:t xml:space="preserve">Subimos nuestro archivo a </w:t>
+      </w:r>
+      <w:proofErr w:type="gramStart"/>
+      <w:r>
+        <w:rPr>
+          <w:rFonts w:ascii="Times New Roman" w:hAnsi="Times New Roman" w:cs="Times New Roman"/>
+          <w:sz w:val="24"/>
+          <w:szCs w:val="24"/>
+          <w:lang w:eastAsia="es-EC"/>
+        </w:rPr>
+        <w:t>GitHub(</w:t>
+      </w:r>
+      <w:proofErr w:type="gramEnd"/>
+      <w:r>
+        <w:rPr>
+          <w:rFonts w:ascii="Times New Roman" w:hAnsi="Times New Roman" w:cs="Times New Roman"/>
+          <w:sz w:val="24"/>
+          <w:szCs w:val="24"/>
+          <w:lang w:eastAsia="es-EC"/>
+        </w:rPr>
+        <w:t>La nube)</w:t>
+      </w:r>
+    </w:p>
+    <w:p>
+      <w:pPr>
+        <w:spacing w:line="360" w:lineRule="auto"/>
+        <w:jc w:val="center"/>
+        <w:rPr>
+          <w:rFonts w:ascii="Times New Roman" w:hAnsi="Times New Roman" w:cs="Times New Roman"/>
+          <w:b/>
+          <w:bCs/>
+          <w:sz w:val="24"/>
+          <w:szCs w:val="24"/>
+          <w:lang w:eastAsia="es-EC"/>
+        </w:rPr>
+      </w:pPr>
+      <w:r>
+        <w:rPr>
+          <w:rFonts w:ascii="Times New Roman" w:hAnsi="Times New Roman" w:cs="Times New Roman"/>
+          <w:b/>
+          <w:bCs/>
+          <w:noProof/>
+          <w:sz w:val="24"/>
+          <w:szCs w:val="24"/>
+          <w:lang w:eastAsia="es-EC"/>
+        </w:rPr>
+        <w:drawing>
+          <wp:inline distT="0" distB="0" distL="0" distR="0" wp14:anchorId="204C41C7" wp14:editId="40A619F9">
+            <wp:extent cx="4791684" cy="2590800"/>
+            <wp:effectExtent l="0" t="0" r="9525" b="0"/>
+            <wp:docPr id="8" name="Imagen 8" descr="Texto&#10;&#10;El contenido generado por IA puede ser incorrecto."/>
+            <wp:cNvGraphicFramePr>
+              <a:graphicFrameLocks xmlns:a="http://schemas.openxmlformats.org/drawingml/2006/main" noChangeAspect="1"/>
+            </wp:cNvGraphicFramePr>
+            <a:graphic xmlns:a="http://schemas.openxmlformats.org/drawingml/2006/main">
+              <a:graphicData uri="http://schemas.openxmlformats.org/drawingml/2006/picture">
+                <pic:pic xmlns:pic="http://schemas.openxmlformats.org/drawingml/2006/picture">
+                  <pic:nvPicPr>
+                    <pic:cNvPr id="8" name="Imagen 8" descr="Texto&#10;&#10;El contenido generado por IA puede ser incorrecto."/>
+                    <pic:cNvPicPr/>
+                  </pic:nvPicPr>
+                  <pic:blipFill>
+                    <a:blip r:embed="rId22">
+                      <a:extLst>
+                        <a:ext uri="{28A0092B-C50C-407E-A947-70E740481C1C}">
+                          <a14:useLocalDpi xmlns:a14="http://schemas.microsoft.com/office/drawing/2010/main" val="0"/>
+                        </a:ext>
+                      </a:extLst>
+                    </a:blip>
+                    <a:stretch>
+                      <a:fillRect/>
+                    </a:stretch>
+                  </pic:blipFill>
+                  <pic:spPr>
+                    <a:xfrm>
+                      <a:off x="0" y="0"/>
+                      <a:ext cx="4801324" cy="2596012"/>
+                    </a:xfrm>
+                    <a:prstGeom prst="rect">
+                      <a:avLst/>
+                    </a:prstGeom>
+                  </pic:spPr>
+                </pic:pic>
+              </a:graphicData>
+            </a:graphic>
+          </wp:inline>
+        </w:drawing>
+      </w:r>
+    </w:p>
+    <w:p>
+      <w:pPr>
+        <w:spacing w:line="360" w:lineRule="auto"/>
+        <w:jc w:val="center"/>
+        <w:rPr>
+          <w:rFonts w:ascii="Times New Roman" w:hAnsi="Times New Roman" w:cs="Times New Roman"/>
+          <w:b/>
+          <w:bCs/>
+          <w:sz w:val="24"/>
+          <w:szCs w:val="24"/>
+          <w:lang w:eastAsia="es-EC"/>
+        </w:rPr>
+      </w:pPr>
+    </w:p>
+    <w:p>
+      <w:pPr>
+        <w:spacing w:line="360" w:lineRule="auto"/>
+        <w:jc w:val="center"/>
+        <w:rPr>
+          <w:rFonts w:ascii="Times New Roman" w:hAnsi="Times New Roman" w:cs="Times New Roman"/>
+          <w:b/>
+          <w:bCs/>
+          <w:sz w:val="24"/>
+          <w:szCs w:val="24"/>
+          <w:lang w:eastAsia="es-EC"/>
+        </w:rPr>
+      </w:pPr>
+    </w:p>
+    <w:p>
+      <w:pPr>
+        <w:spacing w:line="360" w:lineRule="auto"/>
+        <w:rPr>
+          <w:rFonts w:ascii="Times New Roman" w:hAnsi="Times New Roman" w:cs="Times New Roman"/>
+          <w:sz w:val="24"/>
+          <w:szCs w:val="24"/>
+          <w:lang w:eastAsia="es-EC"/>
+        </w:rPr>
+      </w:pPr>
+      <w:r>
+        <w:rPr>
+          <w:rFonts w:ascii="Times New Roman" w:hAnsi="Times New Roman" w:cs="Times New Roman"/>
+          <w:sz w:val="24"/>
+          <w:szCs w:val="24"/>
+          <w:lang w:eastAsia="es-EC"/>
+        </w:rPr>
+        <w:t xml:space="preserve">Usamos </w:t>
+      </w:r>
+      <w:proofErr w:type="spellStart"/>
+      <w:r>
+        <w:rPr>
+          <w:rFonts w:ascii="Times New Roman" w:hAnsi="Times New Roman" w:cs="Times New Roman"/>
+          <w:sz w:val="24"/>
+          <w:szCs w:val="24"/>
+          <w:lang w:eastAsia="es-EC"/>
+        </w:rPr>
+        <w:t>git</w:t>
+      </w:r>
+      <w:proofErr w:type="spellEnd"/>
+      <w:r>
+        <w:rPr>
+          <w:rFonts w:ascii="Times New Roman" w:hAnsi="Times New Roman" w:cs="Times New Roman"/>
+          <w:sz w:val="24"/>
+          <w:szCs w:val="24"/>
+          <w:lang w:eastAsia="es-EC"/>
+        </w:rPr>
+        <w:t xml:space="preserve"> </w:t>
+      </w:r>
+      <w:proofErr w:type="spellStart"/>
+      <w:r>
+        <w:rPr>
+          <w:rFonts w:ascii="Times New Roman" w:hAnsi="Times New Roman" w:cs="Times New Roman"/>
+          <w:sz w:val="24"/>
+          <w:szCs w:val="24"/>
+          <w:lang w:eastAsia="es-EC"/>
+        </w:rPr>
+        <w:t>commit</w:t>
+      </w:r>
+      <w:proofErr w:type="spellEnd"/>
+      <w:r>
+        <w:rPr>
+          <w:rFonts w:ascii="Times New Roman" w:hAnsi="Times New Roman" w:cs="Times New Roman"/>
+          <w:sz w:val="24"/>
+          <w:szCs w:val="24"/>
+          <w:lang w:eastAsia="es-EC"/>
+        </w:rPr>
+        <w:t xml:space="preserve"> -m para “actualizar nombre de archivo” y </w:t>
+      </w:r>
+      <w:proofErr w:type="spellStart"/>
+      <w:r>
+        <w:rPr>
+          <w:rFonts w:ascii="Times New Roman" w:hAnsi="Times New Roman" w:cs="Times New Roman"/>
+          <w:sz w:val="24"/>
+          <w:szCs w:val="24"/>
+          <w:lang w:eastAsia="es-EC"/>
+        </w:rPr>
+        <w:t>asi</w:t>
+      </w:r>
+      <w:proofErr w:type="spellEnd"/>
+      <w:r>
+        <w:rPr>
+          <w:rFonts w:ascii="Times New Roman" w:hAnsi="Times New Roman" w:cs="Times New Roman"/>
+          <w:sz w:val="24"/>
+          <w:szCs w:val="24"/>
+          <w:lang w:eastAsia="es-EC"/>
+        </w:rPr>
+        <w:t xml:space="preserve"> registrar una actualización</w:t>
+      </w:r>
+    </w:p>
+    <w:p>
+      <w:pPr>
+        <w:spacing w:line="360" w:lineRule="auto"/>
+        <w:jc w:val="both"/>
+        <w:rPr>
+          <w:rFonts w:ascii="Times New Roman" w:hAnsi="Times New Roman" w:cs="Times New Roman"/>
+          <w:b/>
+          <w:bCs/>
+          <w:sz w:val="24"/>
+          <w:szCs w:val="24"/>
+          <w:lang w:eastAsia="es-EC"/>
+        </w:rPr>
+      </w:pPr>
+      <w:r>
+        <w:rPr>
+          <w:rFonts w:ascii="Times New Roman" w:hAnsi="Times New Roman" w:cs="Times New Roman"/>
+          <w:b/>
+          <w:bCs/>
+          <w:noProof/>
+          <w:sz w:val="24"/>
+          <w:szCs w:val="24"/>
+          <w:lang w:eastAsia="es-EC"/>
+        </w:rPr>
+        <w:drawing>
+          <wp:inline distT="0" distB="0" distL="0" distR="0" wp14:anchorId="3013118D" wp14:editId="1CC392B4">
+            <wp:extent cx="4910414" cy="2636520"/>
+            <wp:effectExtent l="0" t="0" r="5080" b="0"/>
+            <wp:docPr id="7" name="Imagen 7" descr="Texto&#10;&#10;El contenido generado por IA puede ser incorrecto."/>
+            <wp:cNvGraphicFramePr>
+              <a:graphicFrameLocks xmlns:a="http://schemas.openxmlformats.org/drawingml/2006/main" noChangeAspect="1"/>
+            </wp:cNvGraphicFramePr>
+            <a:graphic xmlns:a="http://schemas.openxmlformats.org/drawingml/2006/main">
+              <a:graphicData uri="http://schemas.openxmlformats.org/drawingml/2006/picture">
+                <pic:pic xmlns:pic="http://schemas.openxmlformats.org/drawingml/2006/picture">
+                  <pic:nvPicPr>
+                    <pic:cNvPr id="7" name="Imagen 7" descr="Texto&#10;&#10;El contenido generado por IA puede ser incorrecto."/>
+                    <pic:cNvPicPr/>
+                  </pic:nvPicPr>
+                  <pic:blipFill>
+                    <a:blip r:embed="rId23">
+                      <a:extLst>
+                        <a:ext uri="{28A0092B-C50C-407E-A947-70E740481C1C}">
+                          <a14:useLocalDpi xmlns:a14="http://schemas.microsoft.com/office/drawing/2010/main" val="0"/>
+                        </a:ext>
+                      </a:extLst>
+                    </a:blip>
+                    <a:stretch>
+                      <a:fillRect/>
+                    </a:stretch>
+                  </pic:blipFill>
+                  <pic:spPr>
+                    <a:xfrm>
+                      <a:off x="0" y="0"/>
+                      <a:ext cx="4942183" cy="2653577"/>
+                    </a:xfrm>
+                    <a:prstGeom prst="rect">
+                      <a:avLst/>
+                    </a:prstGeom>
+                  </pic:spPr>
+                </pic:pic>
+              </a:graphicData>
+            </a:graphic>
+          </wp:inline>
+        </w:drawing>
+      </w:r>
+    </w:p>
+    <w:p>
+      <w:pPr>
+        <w:spacing w:line="360" w:lineRule="auto"/>
+        <w:jc w:val="both"/>
+        <w:rPr>
+          <w:rFonts w:ascii="Times New Roman" w:hAnsi="Times New Roman" w:cs="Times New Roman"/>
+          <w:b/>
+          <w:bCs/>
+          <w:sz w:val="24"/>
+          <w:szCs w:val="24"/>
+          <w:lang w:eastAsia="es-EC"/>
+        </w:rPr>
+      </w:pPr>
+    </w:p>
+    <w:p>
+      <w:pPr>
+        <w:pStyle w:val="Prrafodelista"/>
+        <w:numPr>
+          <w:ilvl w:val="0"/>
+          <w:numId w:val="25"/>
+        </w:numPr>
+        <w:spacing w:line="360" w:lineRule="auto"/>
+        <w:jc w:val="both"/>
+        <w:rPr>
+          <w:rFonts w:ascii="Times New Roman" w:hAnsi="Times New Roman" w:cs="Times New Roman"/>
+          <w:b/>
+          <w:bCs/>
+          <w:sz w:val="24"/>
+          <w:szCs w:val="24"/>
+          <w:lang w:eastAsia="es-EC"/>
+        </w:rPr>
+      </w:pPr>
+      <w:r>
+        <w:rPr>
+          <w:rFonts w:ascii="Times New Roman" w:hAnsi="Times New Roman" w:cs="Times New Roman"/>
+          <w:b/>
+          <w:bCs/>
+          <w:sz w:val="24"/>
+          <w:szCs w:val="24"/>
+          <w:lang w:eastAsia="es-EC"/>
+        </w:rPr>
+        <w:t xml:space="preserve">Conclusiones </w:t>
+      </w:r>
+    </w:p>
+    <w:p>
+      <w:pPr>
+        <w:spacing w:line="360" w:lineRule="auto"/>
+        <w:jc w:val="both"/>
+        <w:rPr>
+          <w:rFonts w:ascii="Times New Roman" w:hAnsi="Times New Roman" w:cs="Times New Roman"/>
+          <w:sz w:val="24"/>
+          <w:szCs w:val="24"/>
+          <w:lang w:eastAsia="es-EC"/>
+        </w:rPr>
+      </w:pPr>
+      <w:r>
+        <w:rPr>
+          <w:rFonts w:ascii="Times New Roman" w:hAnsi="Times New Roman" w:cs="Times New Roman"/>
+          <w:sz w:val="24"/>
+          <w:szCs w:val="24"/>
+          <w:lang w:eastAsia="es-EC"/>
+        </w:rPr>
+        <w:t>El Sistema de Control de Rescate y Adopción Animal utilizará tres patrones de diseño</w:t>
+      </w:r>
+      <w:r>
+        <w:rPr>
+          <w:rFonts w:ascii="Times New Roman" w:hAnsi="Times New Roman" w:cs="Times New Roman"/>
+          <w:sz w:val="24"/>
+          <w:szCs w:val="24"/>
+          <w:lang w:eastAsia="es-EC"/>
+        </w:rPr>
+        <w:t>,</w:t>
+      </w:r>
+      <w:r>
+        <w:rPr>
+          <w:rFonts w:ascii="Times New Roman" w:hAnsi="Times New Roman" w:cs="Times New Roman"/>
+          <w:sz w:val="24"/>
+          <w:szCs w:val="24"/>
+          <w:lang w:eastAsia="es-EC"/>
+        </w:rPr>
+        <w:t xml:space="preserve"> MVC, Factory </w:t>
+      </w:r>
+      <w:proofErr w:type="spellStart"/>
+      <w:r>
+        <w:rPr>
+          <w:rFonts w:ascii="Times New Roman" w:hAnsi="Times New Roman" w:cs="Times New Roman"/>
+          <w:sz w:val="24"/>
+          <w:szCs w:val="24"/>
+          <w:lang w:eastAsia="es-EC"/>
+        </w:rPr>
+        <w:t>Method</w:t>
+      </w:r>
+      <w:proofErr w:type="spellEnd"/>
+      <w:r>
+        <w:rPr>
+          <w:rFonts w:ascii="Times New Roman" w:hAnsi="Times New Roman" w:cs="Times New Roman"/>
+          <w:sz w:val="24"/>
+          <w:szCs w:val="24"/>
+          <w:lang w:eastAsia="es-EC"/>
+        </w:rPr>
+        <w:t xml:space="preserve"> y </w:t>
+      </w:r>
+      <w:proofErr w:type="spellStart"/>
+      <w:r>
+        <w:rPr>
+          <w:rFonts w:ascii="Times New Roman" w:hAnsi="Times New Roman" w:cs="Times New Roman"/>
+          <w:sz w:val="24"/>
+          <w:szCs w:val="24"/>
+          <w:lang w:eastAsia="es-EC"/>
+        </w:rPr>
+        <w:t>Observer</w:t>
+      </w:r>
+      <w:proofErr w:type="spellEnd"/>
+      <w:r>
+        <w:rPr>
+          <w:rFonts w:ascii="Times New Roman" w:hAnsi="Times New Roman" w:cs="Times New Roman"/>
+          <w:sz w:val="24"/>
+          <w:szCs w:val="24"/>
+          <w:lang w:eastAsia="es-EC"/>
+        </w:rPr>
+        <w:t>. MVC permite organizar la presentación, el procesamiento y los datos</w:t>
+      </w:r>
+      <w:r>
+        <w:rPr>
+          <w:rFonts w:ascii="Times New Roman" w:hAnsi="Times New Roman" w:cs="Times New Roman"/>
+          <w:sz w:val="24"/>
+          <w:szCs w:val="24"/>
+          <w:lang w:eastAsia="es-EC"/>
+        </w:rPr>
+        <w:t>, mientras que</w:t>
+      </w:r>
+      <w:r>
+        <w:rPr>
+          <w:rFonts w:ascii="Times New Roman" w:hAnsi="Times New Roman" w:cs="Times New Roman"/>
+          <w:sz w:val="24"/>
+          <w:szCs w:val="24"/>
+          <w:lang w:eastAsia="es-EC"/>
+        </w:rPr>
+        <w:t xml:space="preserve"> Factory </w:t>
+      </w:r>
+      <w:proofErr w:type="spellStart"/>
+      <w:r>
+        <w:rPr>
+          <w:rFonts w:ascii="Times New Roman" w:hAnsi="Times New Roman" w:cs="Times New Roman"/>
+          <w:sz w:val="24"/>
+          <w:szCs w:val="24"/>
+          <w:lang w:eastAsia="es-EC"/>
+        </w:rPr>
+        <w:t>Method</w:t>
+      </w:r>
+      <w:proofErr w:type="spellEnd"/>
+      <w:r>
+        <w:rPr>
+          <w:rFonts w:ascii="Times New Roman" w:hAnsi="Times New Roman" w:cs="Times New Roman"/>
+          <w:sz w:val="24"/>
+          <w:szCs w:val="24"/>
+          <w:lang w:eastAsia="es-EC"/>
+        </w:rPr>
+        <w:t xml:space="preserve"> facilita crear expedientes específicos para perros y gatos</w:t>
+      </w:r>
+      <w:r>
+        <w:rPr>
+          <w:rFonts w:ascii="Times New Roman" w:hAnsi="Times New Roman" w:cs="Times New Roman"/>
+          <w:sz w:val="24"/>
+          <w:szCs w:val="24"/>
+          <w:lang w:eastAsia="es-EC"/>
+        </w:rPr>
+        <w:t>,</w:t>
+      </w:r>
+      <w:r>
+        <w:rPr>
+          <w:rFonts w:ascii="Times New Roman" w:hAnsi="Times New Roman" w:cs="Times New Roman"/>
+          <w:sz w:val="24"/>
+          <w:szCs w:val="24"/>
+          <w:lang w:eastAsia="es-EC"/>
+        </w:rPr>
+        <w:t xml:space="preserve"> y </w:t>
+      </w:r>
+      <w:proofErr w:type="spellStart"/>
+      <w:r>
+        <w:rPr>
+          <w:rFonts w:ascii="Times New Roman" w:hAnsi="Times New Roman" w:cs="Times New Roman"/>
+          <w:sz w:val="24"/>
+          <w:szCs w:val="24"/>
+          <w:lang w:eastAsia="es-EC"/>
+        </w:rPr>
+        <w:t>Observer</w:t>
+      </w:r>
+      <w:proofErr w:type="spellEnd"/>
+      <w:r>
+        <w:rPr>
+          <w:rFonts w:ascii="Times New Roman" w:hAnsi="Times New Roman" w:cs="Times New Roman"/>
+          <w:sz w:val="24"/>
+          <w:szCs w:val="24"/>
+          <w:lang w:eastAsia="es-EC"/>
+        </w:rPr>
+        <w:t xml:space="preserve"> permite comunicar automáticamente los nuevos casos a los voluntarios.</w:t>
+      </w:r>
+    </w:p>
+    <w:p>
+      <w:pPr>
+        <w:spacing w:line="360" w:lineRule="auto"/>
+        <w:jc w:val="both"/>
+        <w:rPr>
+          <w:rFonts w:ascii="Times New Roman" w:hAnsi="Times New Roman" w:cs="Times New Roman"/>
+          <w:sz w:val="24"/>
+          <w:szCs w:val="24"/>
+          <w:lang w:eastAsia="es-EC"/>
+        </w:rPr>
+      </w:pPr>
+      <w:r>
+        <w:rPr>
+          <w:rFonts w:ascii="Times New Roman" w:hAnsi="Times New Roman" w:cs="Times New Roman"/>
+          <w:sz w:val="24"/>
+          <w:szCs w:val="24"/>
+          <w:lang w:eastAsia="es-EC"/>
+        </w:rPr>
         <w:t xml:space="preserve">Estos patrones contribuyen a separar responsabilidades y reducir el acoplamiento entre las clases. Junto con los principios SOLID y el flujo de trabajo </w:t>
       </w:r>
       <w:proofErr w:type="spellStart"/>
@@ -4979,25 +6088,6 @@
           <w:lang w:eastAsia="es-EC"/>
         </w:rPr>
         <w:t>, proporcionan una base organizada para desarrollar, mantener y ampliar el sistema.</w:t>
-      </w:r>
-    </w:p>
-    <w:p>
-      <w:pPr>
-        <w:rPr>
-          <w:rFonts w:ascii="Arial" w:hAnsi="Arial" w:cs="Arial"/>
-          <w:b/>
-          <w:bCs/>
-          <w:lang w:eastAsia="es-EC"/>
-        </w:rPr>
-      </w:pPr>
-      <w:r>
-        <w:rPr>
-          <w:rFonts w:ascii="Arial" w:hAnsi="Arial" w:cs="Arial"/>
-          <w:b/>
-          <w:bCs/>
-          <w:lang w:eastAsia="es-EC"/>
-        </w:rPr>
-        <w:br w:type="page"/>
       </w:r>
     </w:p>
     <w:p>
@@ -5006,79 +6096,24 @@
         <w:spacing w:line="360" w:lineRule="auto"/>
         <w:jc w:val="both"/>
         <w:rPr>
-          <w:rFonts w:ascii="Arial" w:hAnsi="Arial" w:cs="Arial"/>
+          <w:rFonts w:ascii="Times New Roman" w:hAnsi="Times New Roman" w:cs="Times New Roman"/>
           <w:b/>
           <w:bCs/>
-          <w:lang w:eastAsia="es-EC"/>
-        </w:rPr>
-      </w:pPr>
-      <w:r>
-        <w:rPr>
-          <w:rFonts w:ascii="Arial" w:hAnsi="Arial" w:cs="Arial"/>
-          <w:b/>
-          <w:bCs/>
-          <w:lang w:eastAsia="es-EC"/>
-        </w:rPr>
-        <w:lastRenderedPageBreak/>
-        <w:t>Evidencias</w:t>
-      </w:r>
-    </w:p>
-    <w:p>
-      <w:pPr>
-        <w:widowControl w:val="0"/>
-        <w:pBdr>
-          <w:top w:val="nil"/>
-          <w:left w:val="nil"/>
-          <w:bottom w:val="nil"/>
-          <w:right w:val="nil"/>
-          <w:between w:val="nil"/>
-        </w:pBdr>
-        <w:spacing w:after="0" w:line="240" w:lineRule="auto"/>
-        <w:jc w:val="both"/>
-        <w:rPr>
-          <w:rFonts w:ascii="Arial" w:eastAsiaTheme="majorEastAsia" w:hAnsi="Arial" w:cs="Arial"/>
-          <w:b/>
-          <w:bCs/>
-          <w:color w:val="2F5496" w:themeColor="accent1" w:themeShade="BF"/>
-          <w:sz w:val="24"/>
-          <w:szCs w:val="24"/>
-          <w:lang w:eastAsia="es-EC"/>
-        </w:rPr>
-      </w:pPr>
-      <w:r>
-        <w:rPr>
-          <w:rFonts w:ascii="Arial" w:hAnsi="Arial" w:cs="Arial"/>
-          <w:b/>
-          <w:bCs/>
-          <w:i/>
-          <w:iCs/>
           <w:sz w:val="20"/>
           <w:szCs w:val="20"/>
           <w:lang w:eastAsia="es-EC"/>
         </w:rPr>
-        <w:t>(</w:t>
-      </w:r>
-      <w:r>
-        <w:rPr>
-          <w:rFonts w:ascii="Arial" w:eastAsia="Arial" w:hAnsi="Arial" w:cs="Arial"/>
-          <w:i/>
-          <w:iCs/>
-          <w:color w:val="000000"/>
+      </w:pPr>
+      <w:r>
+        <w:rPr>
+          <w:rFonts w:ascii="Times New Roman" w:hAnsi="Times New Roman" w:cs="Times New Roman"/>
+          <w:b/>
+          <w:bCs/>
           <w:sz w:val="20"/>
           <w:szCs w:val="20"/>
-        </w:rPr>
-        <w:t>Código de la ejecución de los ejercicios, enlace drive donde se encuentren los mismos y Capturas de pantalla claras y relevantes, donde evidencie el proceso realizado).</w:t>
-      </w:r>
-      <w:r>
-        <w:rPr>
-          <w:rFonts w:ascii="Arial" w:hAnsi="Arial" w:cs="Arial"/>
-          <w:b/>
-          <w:bCs/>
-          <w:sz w:val="24"/>
-          <w:szCs w:val="24"/>
-          <w:lang w:eastAsia="es-EC"/>
-        </w:rPr>
-        <w:br w:type="page"/>
+          <w:lang w:eastAsia="es-EC"/>
+        </w:rPr>
+        <w:t>ENLACE A DIAGRAMA DE CLASES UML</w:t>
       </w:r>
     </w:p>
     <w:p>
@@ -5087,80 +6122,158 @@
         <w:spacing w:line="360" w:lineRule="auto"/>
         <w:jc w:val="both"/>
         <w:rPr>
-          <w:rFonts w:ascii="Arial" w:hAnsi="Arial" w:cs="Arial"/>
+          <w:rFonts w:ascii="Times New Roman" w:hAnsi="Times New Roman" w:cs="Times New Roman"/>
           <w:b/>
           <w:bCs/>
-          <w:lang w:eastAsia="es-EC"/>
-        </w:rPr>
-      </w:pPr>
-      <w:r>
-        <w:rPr>
-          <w:rFonts w:ascii="Arial" w:hAnsi="Arial" w:cs="Arial"/>
-          <w:b/>
-          <w:bCs/>
-          <w:lang w:eastAsia="es-EC"/>
-        </w:rPr>
-        <w:lastRenderedPageBreak/>
-        <w:t>Bibliografía</w:t>
-      </w:r>
-    </w:p>
-    <w:p>
-      <w:pPr>
-        <w:widowControl w:val="0"/>
-        <w:pBdr>
-          <w:top w:val="nil"/>
-          <w:left w:val="nil"/>
-          <w:bottom w:val="nil"/>
-          <w:right w:val="nil"/>
-          <w:between w:val="nil"/>
-        </w:pBdr>
-        <w:spacing w:after="0" w:line="240" w:lineRule="auto"/>
-        <w:jc w:val="both"/>
-        <w:rPr>
-          <w:rFonts w:ascii="Arial" w:hAnsi="Arial" w:cs="Arial"/>
-          <w:i/>
-          <w:iCs/>
           <w:sz w:val="20"/>
           <w:szCs w:val="20"/>
           <w:lang w:eastAsia="es-EC"/>
         </w:rPr>
       </w:pPr>
-      <w:r>
-        <w:rPr>
-          <w:rFonts w:ascii="Arial" w:hAnsi="Arial" w:cs="Arial"/>
-          <w:i/>
-          <w:iCs/>
+      <w:hyperlink r:id="rId24" w:history="1">
+        <w:r>
+          <w:rPr>
+            <w:rStyle w:val="Hipervnculo"/>
+            <w:rFonts w:ascii="Times New Roman" w:hAnsi="Times New Roman" w:cs="Times New Roman"/>
+            <w:b/>
+            <w:bCs/>
+            <w:sz w:val="20"/>
+            <w:szCs w:val="20"/>
+            <w:lang w:eastAsia="es-EC"/>
+          </w:rPr>
+          <w:t>https://lucid.app/lucidchart/8897699e-095d-4d2a-9504-8c6bb2edd7c4/edit?viewport_loc=-256%2C140%2C3072%2C1398%2C0_0&amp;invitationId=inv_7dd3097d-c249-4787-a5a7-ac15e6435a7a</w:t>
+        </w:r>
+      </w:hyperlink>
+    </w:p>
+    <w:p>
+      <w:pPr>
+        <w:pStyle w:val="Sinespaciado"/>
+        <w:spacing w:line="360" w:lineRule="auto"/>
+        <w:jc w:val="both"/>
+        <w:rPr>
+          <w:rFonts w:ascii="Times New Roman" w:hAnsi="Times New Roman" w:cs="Times New Roman"/>
+          <w:b/>
+          <w:bCs/>
+          <w:lang w:eastAsia="es-EC"/>
+        </w:rPr>
+      </w:pPr>
+      <w:r>
+        <w:rPr>
+          <w:rFonts w:ascii="Times New Roman" w:hAnsi="Times New Roman" w:cs="Times New Roman"/>
+          <w:b/>
+          <w:bCs/>
+          <w:lang w:eastAsia="es-EC"/>
+        </w:rPr>
+        <w:t>ENLACE A DIAGRAMA DE SECUENCIAS UML</w:t>
+      </w:r>
+    </w:p>
+    <w:p>
+      <w:pPr>
+        <w:pStyle w:val="Sinespaciado"/>
+        <w:spacing w:line="360" w:lineRule="auto"/>
+        <w:jc w:val="both"/>
+        <w:rPr>
+          <w:rFonts w:ascii="Times New Roman" w:hAnsi="Times New Roman" w:cs="Times New Roman"/>
+          <w:b/>
+          <w:bCs/>
           <w:sz w:val="20"/>
           <w:szCs w:val="20"/>
           <w:lang w:eastAsia="es-EC"/>
         </w:rPr>
-        <w:t>(</w:t>
-      </w:r>
-      <w:r>
-        <w:rPr>
-          <w:rFonts w:ascii="Arial" w:hAnsi="Arial" w:cs="Arial"/>
-          <w:i/>
-          <w:iCs/>
+      </w:pPr>
+      <w:hyperlink r:id="rId25" w:history="1">
+        <w:r>
+          <w:rPr>
+            <w:rStyle w:val="Hipervnculo"/>
+            <w:rFonts w:ascii="Times New Roman" w:hAnsi="Times New Roman" w:cs="Times New Roman"/>
+            <w:b/>
+            <w:bCs/>
+            <w:sz w:val="20"/>
+            <w:szCs w:val="20"/>
+            <w:lang w:eastAsia="es-EC"/>
+          </w:rPr>
+          <w:t>https://lucid.app/lucidchart/310fbe1a-6a5e-4367-b62b-3cd7f5abe614/edit?viewport_loc=-921%2C-188%2C4608%2C2097%2C0_0&amp;invitationId=inv_5d529346-0f19-4048-a0e6-72f65e8b738f</w:t>
+        </w:r>
+      </w:hyperlink>
+    </w:p>
+    <w:p>
+      <w:pPr>
+        <w:pStyle w:val="Sinespaciado"/>
+        <w:spacing w:line="360" w:lineRule="auto"/>
+        <w:jc w:val="both"/>
+        <w:rPr>
+          <w:rFonts w:ascii="Times New Roman" w:hAnsi="Times New Roman" w:cs="Times New Roman"/>
+          <w:b/>
+          <w:bCs/>
           <w:sz w:val="20"/>
           <w:szCs w:val="20"/>
           <w:lang w:eastAsia="es-EC"/>
         </w:rPr>
-        <w:t>Referencias bibliográficas y/o enlaces en Internet (normas APA) que se utilizaron para realizar la práctica.</w:t>
-      </w:r>
-      <w:r>
-        <w:rPr>
-          <w:rFonts w:ascii="Arial" w:hAnsi="Arial" w:cs="Arial"/>
-          <w:i/>
-          <w:iCs/>
+      </w:pPr>
+      <w:r>
+        <w:rPr>
+          <w:rFonts w:ascii="Times New Roman" w:hAnsi="Times New Roman" w:cs="Times New Roman"/>
+          <w:b/>
+          <w:bCs/>
           <w:sz w:val="20"/>
           <w:szCs w:val="20"/>
           <w:lang w:eastAsia="es-EC"/>
         </w:rPr>
-        <w:t>)</w:t>
-      </w:r>
+        <w:t>ENLACE A</w:t>
+      </w:r>
+      <w:r>
+        <w:rPr>
+          <w:rFonts w:ascii="Times New Roman" w:hAnsi="Times New Roman" w:cs="Times New Roman"/>
+          <w:b/>
+          <w:bCs/>
+          <w:sz w:val="20"/>
+          <w:szCs w:val="20"/>
+          <w:lang w:eastAsia="es-EC"/>
+        </w:rPr>
+        <w:t xml:space="preserve"> REPOSITORIO DE GITHUB</w:t>
+      </w:r>
+    </w:p>
+    <w:p>
+      <w:pPr>
+        <w:pStyle w:val="Sinespaciado"/>
+        <w:spacing w:line="360" w:lineRule="auto"/>
+        <w:jc w:val="both"/>
+        <w:rPr>
+          <w:rFonts w:ascii="Times New Roman" w:hAnsi="Times New Roman" w:cs="Times New Roman"/>
+          <w:b/>
+          <w:bCs/>
+          <w:sz w:val="20"/>
+          <w:szCs w:val="20"/>
+          <w:lang w:eastAsia="es-EC"/>
+        </w:rPr>
+      </w:pPr>
+      <w:hyperlink r:id="rId26" w:history="1">
+        <w:r>
+          <w:rPr>
+            <w:rStyle w:val="Hipervnculo"/>
+            <w:rFonts w:ascii="Times New Roman" w:hAnsi="Times New Roman" w:cs="Times New Roman"/>
+            <w:b/>
+            <w:bCs/>
+            <w:sz w:val="20"/>
+            <w:szCs w:val="20"/>
+            <w:lang w:eastAsia="es-EC"/>
+          </w:rPr>
+          <w:t>https://github.com/bclemente2210-cell/Actividad1SDI</w:t>
+        </w:r>
+      </w:hyperlink>
+    </w:p>
+    <w:p>
+      <w:pPr>
+        <w:rPr>
+          <w:rFonts w:ascii="Arial" w:hAnsi="Arial" w:cs="Arial"/>
+          <w:b/>
+          <w:bCs/>
+          <w:lang w:eastAsia="es-EC"/>
+        </w:rPr>
+      </w:pPr>
     </w:p>
     <w:sectPr>
-      <w:headerReference w:type="first" r:id="rId18"/>
+      <w:headerReference w:type="first" r:id="rId27"/>
       <w:pgSz w:w="11906" w:h="16838"/>
       <w:pgMar w:top="1417" w:right="1701" w:bottom="1417" w:left="1701" w:header="708" w:footer="708" w:gutter="0"/>
       <w:pgNumType w:start="1"/>
@@ -6036,7 +7149,7 @@
         <v:path o:extrusionok="f" gradientshapeok="t" o:connecttype="rect"/>
         <o:lock v:ext="edit" aspectratio="t"/>
       </v:shapetype>
-      <v:shape id="_x0000_i1039" type="#_x0000_t75" style="width:11.4pt;height:11.4pt" o:bullet="t">
+      <v:shape id="_x0000_i1026" type="#_x0000_t75" style="width:11.4pt;height:11.4pt" o:bullet="t">
         <v:imagedata r:id="rId1" o:title="mso3E28"/>
       </v:shape>
     </w:pict>
@@ -7230,7 +8343,7 @@
   <w:abstractNum w:abstractNumId="10" w15:restartNumberingAfterBreak="0">
     <w:nsid w:val="529E4713"/>
     <w:multiLevelType w:val="hybridMultilevel"/>
-    <w:tmpl w:val="78B07348"/>
+    <w:tmpl w:val="15F0E328"/>
     <w:lvl w:ilvl="0" w:tplc="300A0001">
       <w:start w:val="1"/>
       <w:numFmt w:val="bullet"/>
@@ -8167,6 +9280,95 @@
     </w:lvl>
   </w:abstractNum>
   <w:abstractNum w:abstractNumId="18" w15:restartNumberingAfterBreak="0">
+    <w:nsid w:val="6C3460C7"/>
+    <w:multiLevelType w:val="hybridMultilevel"/>
+    <w:tmpl w:val="AB382342"/>
+    <w:lvl w:ilvl="0" w:tplc="300A000F">
+      <w:start w:val="1"/>
+      <w:numFmt w:val="decimal"/>
+      <w:lvlText w:val="%1."/>
+      <w:lvlJc w:val="left"/>
+      <w:pPr>
+        <w:ind w:left="720" w:hanging="360"/>
+      </w:pPr>
+      <w:rPr>
+        <w:rFonts w:hint="default"/>
+      </w:rPr>
+    </w:lvl>
+    <w:lvl w:ilvl="1" w:tplc="300A0019" w:tentative="1">
+      <w:start w:val="1"/>
+      <w:numFmt w:val="lowerLetter"/>
+      <w:lvlText w:val="%2."/>
+      <w:lvlJc w:val="left"/>
+      <w:pPr>
+        <w:ind w:left="1440" w:hanging="360"/>
+      </w:pPr>
+    </w:lvl>
+    <w:lvl w:ilvl="2" w:tplc="300A001B" w:tentative="1">
+      <w:start w:val="1"/>
+      <w:numFmt w:val="lowerRoman"/>
+      <w:lvlText w:val="%3."/>
+      <w:lvlJc w:val="right"/>
+      <w:pPr>
+        <w:ind w:left="2160" w:hanging="180"/>
+      </w:pPr>
+    </w:lvl>
+    <w:lvl w:ilvl="3" w:tplc="300A000F" w:tentative="1">
+      <w:start w:val="1"/>
+      <w:numFmt w:val="decimal"/>
+      <w:lvlText w:val="%4."/>
+      <w:lvlJc w:val="left"/>
+      <w:pPr>
+        <w:ind w:left="2880" w:hanging="360"/>
+      </w:pPr>
+    </w:lvl>
+    <w:lvl w:ilvl="4" w:tplc="300A0019" w:tentative="1">
+      <w:start w:val="1"/>
+      <w:numFmt w:val="lowerLetter"/>
+      <w:lvlText w:val="%5."/>
+      <w:lvlJc w:val="left"/>
+      <w:pPr>
+        <w:ind w:left="3600" w:hanging="360"/>
+      </w:pPr>
+    </w:lvl>
+    <w:lvl w:ilvl="5" w:tplc="300A001B" w:tentative="1">
+      <w:start w:val="1"/>
+      <w:numFmt w:val="lowerRoman"/>
+      <w:lvlText w:val="%6."/>
+      <w:lvlJc w:val="right"/>
+      <w:pPr>
+        <w:ind w:left="4320" w:hanging="180"/>
+      </w:pPr>
+    </w:lvl>
+    <w:lvl w:ilvl="6" w:tplc="300A000F" w:tentative="1">
+      <w:start w:val="1"/>
+      <w:numFmt w:val="decimal"/>
+      <w:lvlText w:val="%7."/>
+      <w:lvlJc w:val="left"/>
+      <w:pPr>
+        <w:ind w:left="5040" w:hanging="360"/>
+      </w:pPr>
+    </w:lvl>
+    <w:lvl w:ilvl="7" w:tplc="300A0019" w:tentative="1">
+      <w:start w:val="1"/>
+      <w:numFmt w:val="lowerLetter"/>
+      <w:lvlText w:val="%8."/>
+      <w:lvlJc w:val="left"/>
+      <w:pPr>
+        <w:ind w:left="5760" w:hanging="360"/>
+      </w:pPr>
+    </w:lvl>
+    <w:lvl w:ilvl="8" w:tplc="300A001B" w:tentative="1">
+      <w:start w:val="1"/>
+      <w:numFmt w:val="lowerRoman"/>
+      <w:lvlText w:val="%9."/>
+      <w:lvlJc w:val="right"/>
+      <w:pPr>
+        <w:ind w:left="6480" w:hanging="180"/>
+      </w:pPr>
+    </w:lvl>
+  </w:abstractNum>
+  <w:abstractNum w:abstractNumId="19" w15:restartNumberingAfterBreak="0">
     <w:nsid w:val="6FA144D3"/>
     <w:multiLevelType w:val="multilevel"/>
     <w:tmpl w:val="98CEB7D6"/>
@@ -8287,7 +9489,7 @@
       </w:rPr>
     </w:lvl>
   </w:abstractNum>
-  <w:abstractNum w:abstractNumId="19" w15:restartNumberingAfterBreak="0">
+  <w:abstractNum w:abstractNumId="20" w15:restartNumberingAfterBreak="0">
     <w:nsid w:val="738344F2"/>
     <w:multiLevelType w:val="hybridMultilevel"/>
     <w:tmpl w:val="C4E037F2"/>
@@ -8402,7 +9604,7 @@
       </w:rPr>
     </w:lvl>
   </w:abstractNum>
-  <w:abstractNum w:abstractNumId="20" w15:restartNumberingAfterBreak="0">
+  <w:abstractNum w:abstractNumId="21" w15:restartNumberingAfterBreak="0">
     <w:nsid w:val="74B1685F"/>
     <w:multiLevelType w:val="hybridMultilevel"/>
     <w:tmpl w:val="943E89B2"/>
@@ -8515,7 +9717,7 @@
       </w:rPr>
     </w:lvl>
   </w:abstractNum>
-  <w:abstractNum w:abstractNumId="21" w15:restartNumberingAfterBreak="0">
+  <w:abstractNum w:abstractNumId="22" w15:restartNumberingAfterBreak="0">
     <w:nsid w:val="75DB1EAD"/>
     <w:multiLevelType w:val="multilevel"/>
     <w:tmpl w:val="F2B0D608"/>
@@ -8628,7 +9830,7 @@
       </w:rPr>
     </w:lvl>
   </w:abstractNum>
-  <w:abstractNum w:abstractNumId="22" w15:restartNumberingAfterBreak="0">
+  <w:abstractNum w:abstractNumId="23" w15:restartNumberingAfterBreak="0">
     <w:nsid w:val="77694BC3"/>
     <w:multiLevelType w:val="hybridMultilevel"/>
     <w:tmpl w:val="8D0A3582"/>
@@ -8741,7 +9943,7 @@
       </w:rPr>
     </w:lvl>
   </w:abstractNum>
-  <w:abstractNum w:abstractNumId="23" w15:restartNumberingAfterBreak="0">
+  <w:abstractNum w:abstractNumId="24" w15:restartNumberingAfterBreak="0">
     <w:nsid w:val="7CE94054"/>
     <w:multiLevelType w:val="multilevel"/>
     <w:tmpl w:val="A4D4C1F2"/>
@@ -8859,16 +10061,16 @@
     <w:abstractNumId w:val="6"/>
   </w:num>
   <w:num w:numId="2" w16cid:durableId="1698920106">
-    <w:abstractNumId w:val="19"/>
+    <w:abstractNumId w:val="20"/>
   </w:num>
   <w:num w:numId="3" w16cid:durableId="1584878695">
-    <w:abstractNumId w:val="18"/>
+    <w:abstractNumId w:val="19"/>
   </w:num>
   <w:num w:numId="4" w16cid:durableId="552355598">
     <w:abstractNumId w:val="16"/>
   </w:num>
   <w:num w:numId="5" w16cid:durableId="61568265">
-    <w:abstractNumId w:val="23"/>
+    <w:abstractNumId w:val="24"/>
   </w:num>
   <w:num w:numId="6" w16cid:durableId="285284544">
     <w:abstractNumId w:val="11"/>
@@ -8877,10 +10079,10 @@
     <w:abstractNumId w:val="17"/>
   </w:num>
   <w:num w:numId="8" w16cid:durableId="280650284">
-    <w:abstractNumId w:val="21"/>
+    <w:abstractNumId w:val="22"/>
   </w:num>
   <w:num w:numId="9" w16cid:durableId="2083868112">
-    <w:abstractNumId w:val="22"/>
+    <w:abstractNumId w:val="23"/>
   </w:num>
   <w:num w:numId="10" w16cid:durableId="2141608936">
     <w:abstractNumId w:val="1"/>
@@ -8901,7 +10103,7 @@
     <w:abstractNumId w:val="0"/>
   </w:num>
   <w:num w:numId="16" w16cid:durableId="758720416">
-    <w:abstractNumId w:val="20"/>
+    <w:abstractNumId w:val="21"/>
   </w:num>
   <w:num w:numId="17" w16cid:durableId="724108694">
     <w:abstractNumId w:val="15"/>
@@ -8926,6 +10128,9 @@
   </w:num>
   <w:num w:numId="24" w16cid:durableId="898440302">
     <w:abstractNumId w:val="10"/>
+  </w:num>
+  <w:num w:numId="25" w16cid:durableId="1068308489">
+    <w:abstractNumId w:val="18"/>
   </w:num>
 </w:numbering>
 </file>
@@ -9419,6 +10624,7 @@
   <w:style w:type="character" w:default="1" w:styleId="Fuentedeprrafopredeter">
     <w:name w:val="Default Paragraph Font"/>
     <w:uiPriority w:val="1"/>
+    <w:semiHidden/>
     <w:unhideWhenUsed/>
   </w:style>
   <w:style w:type="table" w:default="1" w:styleId="Tablanormal">

</xml_diff>